<commit_message>
update ddl and dml
</commit_message>
<xml_diff>
--- a/Final Project/Final Project - Module 3.docx
+++ b/Final Project/Final Project - Module 3.docx
@@ -2876,13 +2876,3047 @@
         <w:t xml:space="preserve">If not automatically created by the DBMS, create indexes corresponding to the primary and foreign keys. (6 marks) </w:t>
       </w:r>
     </w:p>
+    <w:p>
+      <w:pPr>
+        <w:pStyle w:val="ListParagraph"/>
+        <w:rPr>
+          <w:rFonts w:ascii="Courier New" w:hAnsi="Courier New" w:cs="Courier New"/>
+          <w:sz w:val="18"/>
+          <w:szCs w:val="18"/>
+          <w:vertAlign w:val="superscript"/>
+        </w:rPr>
+      </w:pPr>
+      <w:r>
+        <w:rPr>
+          <w:rFonts w:ascii="Courier New" w:hAnsi="Courier New" w:cs="Courier New"/>
+          <w:sz w:val="18"/>
+          <w:szCs w:val="18"/>
+          <w:vertAlign w:val="superscript"/>
+        </w:rPr>
+        <w:t>--- * Indexes:  Oracle creates indexes for primary keys automatically, so we'll just create look-up or behavior related</w:t>
+      </w:r>
+    </w:p>
+    <w:p>
+      <w:pPr>
+        <w:pStyle w:val="ListParagraph"/>
+        <w:rPr>
+          <w:rFonts w:ascii="Courier New" w:hAnsi="Courier New" w:cs="Courier New"/>
+          <w:sz w:val="18"/>
+          <w:szCs w:val="18"/>
+          <w:vertAlign w:val="superscript"/>
+        </w:rPr>
+      </w:pPr>
+      <w:r>
+        <w:rPr>
+          <w:rFonts w:ascii="Courier New" w:hAnsi="Courier New" w:cs="Courier New"/>
+          <w:sz w:val="18"/>
+          <w:szCs w:val="18"/>
+          <w:vertAlign w:val="superscript"/>
+        </w:rPr>
+        <w:tab/>
+        <w:t xml:space="preserve">CREATE INDEX </w:t>
+      </w:r>
+      <w:proofErr w:type="spellStart"/>
+      <w:r>
+        <w:rPr>
+          <w:rFonts w:ascii="Courier New" w:hAnsi="Courier New" w:cs="Courier New"/>
+          <w:sz w:val="18"/>
+          <w:szCs w:val="18"/>
+          <w:vertAlign w:val="superscript"/>
+        </w:rPr>
+        <w:t>idx_patient_care_center</w:t>
+      </w:r>
+      <w:proofErr w:type="spellEnd"/>
+      <w:r>
+        <w:rPr>
+          <w:rFonts w:ascii="Courier New" w:hAnsi="Courier New" w:cs="Courier New"/>
+          <w:sz w:val="18"/>
+          <w:szCs w:val="18"/>
+          <w:vertAlign w:val="superscript"/>
+        </w:rPr>
+        <w:t xml:space="preserve"> on</w:t>
+      </w:r>
+    </w:p>
+    <w:p>
+      <w:pPr>
+        <w:pStyle w:val="ListParagraph"/>
+        <w:rPr>
+          <w:rFonts w:ascii="Courier New" w:hAnsi="Courier New" w:cs="Courier New"/>
+          <w:sz w:val="18"/>
+          <w:szCs w:val="18"/>
+          <w:vertAlign w:val="superscript"/>
+        </w:rPr>
+      </w:pPr>
+      <w:r>
+        <w:rPr>
+          <w:rFonts w:ascii="Courier New" w:hAnsi="Courier New" w:cs="Courier New"/>
+          <w:sz w:val="18"/>
+          <w:szCs w:val="18"/>
+          <w:vertAlign w:val="superscript"/>
+        </w:rPr>
+        <w:tab/>
+      </w:r>
+      <w:r>
+        <w:rPr>
+          <w:rFonts w:ascii="Courier New" w:hAnsi="Courier New" w:cs="Courier New"/>
+          <w:sz w:val="18"/>
+          <w:szCs w:val="18"/>
+          <w:vertAlign w:val="superscript"/>
+        </w:rPr>
+        <w:tab/>
+        <w:t>patients(</w:t>
+      </w:r>
+      <w:proofErr w:type="spellStart"/>
+      <w:r>
+        <w:rPr>
+          <w:rFonts w:ascii="Courier New" w:hAnsi="Courier New" w:cs="Courier New"/>
+          <w:sz w:val="18"/>
+          <w:szCs w:val="18"/>
+          <w:vertAlign w:val="superscript"/>
+        </w:rPr>
+        <w:t>care_center_id</w:t>
+      </w:r>
+      <w:proofErr w:type="spellEnd"/>
+      <w:r>
+        <w:rPr>
+          <w:rFonts w:ascii="Courier New" w:hAnsi="Courier New" w:cs="Courier New"/>
+          <w:sz w:val="18"/>
+          <w:szCs w:val="18"/>
+          <w:vertAlign w:val="superscript"/>
+        </w:rPr>
+        <w:t>);</w:t>
+      </w:r>
+    </w:p>
+    <w:p>
+      <w:pPr>
+        <w:pStyle w:val="ListParagraph"/>
+        <w:rPr>
+          <w:rFonts w:ascii="Courier New" w:hAnsi="Courier New" w:cs="Courier New"/>
+          <w:sz w:val="18"/>
+          <w:szCs w:val="18"/>
+          <w:vertAlign w:val="superscript"/>
+        </w:rPr>
+      </w:pPr>
+      <w:r>
+        <w:rPr>
+          <w:rFonts w:ascii="Courier New" w:hAnsi="Courier New" w:cs="Courier New"/>
+          <w:sz w:val="18"/>
+          <w:szCs w:val="18"/>
+          <w:vertAlign w:val="superscript"/>
+        </w:rPr>
+        <w:tab/>
+      </w:r>
+    </w:p>
+    <w:p>
+      <w:pPr>
+        <w:pStyle w:val="ListParagraph"/>
+        <w:rPr>
+          <w:rFonts w:ascii="Courier New" w:hAnsi="Courier New" w:cs="Courier New"/>
+          <w:sz w:val="18"/>
+          <w:szCs w:val="18"/>
+          <w:vertAlign w:val="superscript"/>
+        </w:rPr>
+      </w:pPr>
+      <w:r>
+        <w:rPr>
+          <w:rFonts w:ascii="Courier New" w:hAnsi="Courier New" w:cs="Courier New"/>
+          <w:sz w:val="18"/>
+          <w:szCs w:val="18"/>
+          <w:vertAlign w:val="superscript"/>
+        </w:rPr>
+        <w:tab/>
+        <w:t xml:space="preserve">CREATE INDEX </w:t>
+      </w:r>
+      <w:proofErr w:type="spellStart"/>
+      <w:r>
+        <w:rPr>
+          <w:rFonts w:ascii="Courier New" w:hAnsi="Courier New" w:cs="Courier New"/>
+          <w:sz w:val="18"/>
+          <w:szCs w:val="18"/>
+          <w:vertAlign w:val="superscript"/>
+        </w:rPr>
+        <w:t>idx_treatments_patient_id</w:t>
+      </w:r>
+      <w:proofErr w:type="spellEnd"/>
+      <w:r>
+        <w:rPr>
+          <w:rFonts w:ascii="Courier New" w:hAnsi="Courier New" w:cs="Courier New"/>
+          <w:sz w:val="18"/>
+          <w:szCs w:val="18"/>
+          <w:vertAlign w:val="superscript"/>
+        </w:rPr>
+        <w:t xml:space="preserve"> on</w:t>
+      </w:r>
+    </w:p>
+    <w:p>
+      <w:pPr>
+        <w:pStyle w:val="ListParagraph"/>
+        <w:rPr>
+          <w:rFonts w:ascii="Courier New" w:hAnsi="Courier New" w:cs="Courier New"/>
+          <w:sz w:val="18"/>
+          <w:szCs w:val="18"/>
+          <w:vertAlign w:val="superscript"/>
+        </w:rPr>
+      </w:pPr>
+      <w:r>
+        <w:rPr>
+          <w:rFonts w:ascii="Courier New" w:hAnsi="Courier New" w:cs="Courier New"/>
+          <w:sz w:val="18"/>
+          <w:szCs w:val="18"/>
+          <w:vertAlign w:val="superscript"/>
+        </w:rPr>
+        <w:tab/>
+      </w:r>
+      <w:r>
+        <w:rPr>
+          <w:rFonts w:ascii="Courier New" w:hAnsi="Courier New" w:cs="Courier New"/>
+          <w:sz w:val="18"/>
+          <w:szCs w:val="18"/>
+          <w:vertAlign w:val="superscript"/>
+        </w:rPr>
+        <w:tab/>
+        <w:t>treatments(</w:t>
+      </w:r>
+      <w:proofErr w:type="spellStart"/>
+      <w:r>
+        <w:rPr>
+          <w:rFonts w:ascii="Courier New" w:hAnsi="Courier New" w:cs="Courier New"/>
+          <w:sz w:val="18"/>
+          <w:szCs w:val="18"/>
+          <w:vertAlign w:val="superscript"/>
+        </w:rPr>
+        <w:t>patient_id</w:t>
+      </w:r>
+      <w:proofErr w:type="spellEnd"/>
+      <w:r>
+        <w:rPr>
+          <w:rFonts w:ascii="Courier New" w:hAnsi="Courier New" w:cs="Courier New"/>
+          <w:sz w:val="18"/>
+          <w:szCs w:val="18"/>
+          <w:vertAlign w:val="superscript"/>
+        </w:rPr>
+        <w:t>);</w:t>
+      </w:r>
+    </w:p>
+    <w:p>
+      <w:pPr>
+        <w:pStyle w:val="ListParagraph"/>
+        <w:rPr>
+          <w:rFonts w:ascii="Courier New" w:hAnsi="Courier New" w:cs="Courier New"/>
+          <w:sz w:val="18"/>
+          <w:szCs w:val="18"/>
+          <w:vertAlign w:val="superscript"/>
+        </w:rPr>
+      </w:pPr>
+      <w:r>
+        <w:rPr>
+          <w:rFonts w:ascii="Courier New" w:hAnsi="Courier New" w:cs="Courier New"/>
+          <w:sz w:val="18"/>
+          <w:szCs w:val="18"/>
+          <w:vertAlign w:val="superscript"/>
+        </w:rPr>
+        <w:tab/>
+        <w:t xml:space="preserve">CREATE INDEX </w:t>
+      </w:r>
+      <w:proofErr w:type="spellStart"/>
+      <w:r>
+        <w:rPr>
+          <w:rFonts w:ascii="Courier New" w:hAnsi="Courier New" w:cs="Courier New"/>
+          <w:sz w:val="18"/>
+          <w:szCs w:val="18"/>
+          <w:vertAlign w:val="superscript"/>
+        </w:rPr>
+        <w:t>idx_treatment_physician_id</w:t>
+      </w:r>
+      <w:proofErr w:type="spellEnd"/>
+      <w:r>
+        <w:rPr>
+          <w:rFonts w:ascii="Courier New" w:hAnsi="Courier New" w:cs="Courier New"/>
+          <w:sz w:val="18"/>
+          <w:szCs w:val="18"/>
+          <w:vertAlign w:val="superscript"/>
+        </w:rPr>
+        <w:t xml:space="preserve"> on</w:t>
+      </w:r>
+    </w:p>
+    <w:p>
+      <w:pPr>
+        <w:pStyle w:val="ListParagraph"/>
+        <w:rPr>
+          <w:rFonts w:ascii="Courier New" w:hAnsi="Courier New" w:cs="Courier New"/>
+          <w:sz w:val="18"/>
+          <w:szCs w:val="18"/>
+          <w:vertAlign w:val="superscript"/>
+        </w:rPr>
+      </w:pPr>
+      <w:r>
+        <w:rPr>
+          <w:rFonts w:ascii="Courier New" w:hAnsi="Courier New" w:cs="Courier New"/>
+          <w:sz w:val="18"/>
+          <w:szCs w:val="18"/>
+          <w:vertAlign w:val="superscript"/>
+        </w:rPr>
+        <w:tab/>
+      </w:r>
+      <w:r>
+        <w:rPr>
+          <w:rFonts w:ascii="Courier New" w:hAnsi="Courier New" w:cs="Courier New"/>
+          <w:sz w:val="18"/>
+          <w:szCs w:val="18"/>
+          <w:vertAlign w:val="superscript"/>
+        </w:rPr>
+        <w:tab/>
+        <w:t>treatments(</w:t>
+      </w:r>
+      <w:proofErr w:type="spellStart"/>
+      <w:r>
+        <w:rPr>
+          <w:rFonts w:ascii="Courier New" w:hAnsi="Courier New" w:cs="Courier New"/>
+          <w:sz w:val="18"/>
+          <w:szCs w:val="18"/>
+          <w:vertAlign w:val="superscript"/>
+        </w:rPr>
+        <w:t>physician_id</w:t>
+      </w:r>
+      <w:proofErr w:type="spellEnd"/>
+      <w:r>
+        <w:rPr>
+          <w:rFonts w:ascii="Courier New" w:hAnsi="Courier New" w:cs="Courier New"/>
+          <w:sz w:val="18"/>
+          <w:szCs w:val="18"/>
+          <w:vertAlign w:val="superscript"/>
+        </w:rPr>
+        <w:t>);</w:t>
+      </w:r>
+    </w:p>
+    <w:p>
+      <w:pPr>
+        <w:pStyle w:val="ListParagraph"/>
+        <w:rPr>
+          <w:rFonts w:ascii="Courier New" w:hAnsi="Courier New" w:cs="Courier New"/>
+          <w:sz w:val="18"/>
+          <w:szCs w:val="18"/>
+          <w:vertAlign w:val="superscript"/>
+        </w:rPr>
+      </w:pPr>
+      <w:r>
+        <w:rPr>
+          <w:rFonts w:ascii="Courier New" w:hAnsi="Courier New" w:cs="Courier New"/>
+          <w:sz w:val="18"/>
+          <w:szCs w:val="18"/>
+          <w:vertAlign w:val="superscript"/>
+        </w:rPr>
+        <w:tab/>
+        <w:t xml:space="preserve">CREATE INDEX </w:t>
+      </w:r>
+      <w:proofErr w:type="spellStart"/>
+      <w:r>
+        <w:rPr>
+          <w:rFonts w:ascii="Courier New" w:hAnsi="Courier New" w:cs="Courier New"/>
+          <w:sz w:val="18"/>
+          <w:szCs w:val="18"/>
+          <w:vertAlign w:val="superscript"/>
+        </w:rPr>
+        <w:t>idx_treatment_date</w:t>
+      </w:r>
+      <w:proofErr w:type="spellEnd"/>
+      <w:r>
+        <w:rPr>
+          <w:rFonts w:ascii="Courier New" w:hAnsi="Courier New" w:cs="Courier New"/>
+          <w:sz w:val="18"/>
+          <w:szCs w:val="18"/>
+          <w:vertAlign w:val="superscript"/>
+        </w:rPr>
+        <w:t xml:space="preserve"> on</w:t>
+      </w:r>
+    </w:p>
+    <w:p>
+      <w:pPr>
+        <w:pStyle w:val="ListParagraph"/>
+        <w:rPr>
+          <w:rFonts w:ascii="Courier New" w:hAnsi="Courier New" w:cs="Courier New"/>
+          <w:sz w:val="18"/>
+          <w:szCs w:val="18"/>
+          <w:vertAlign w:val="superscript"/>
+        </w:rPr>
+      </w:pPr>
+      <w:r>
+        <w:rPr>
+          <w:rFonts w:ascii="Courier New" w:hAnsi="Courier New" w:cs="Courier New"/>
+          <w:sz w:val="18"/>
+          <w:szCs w:val="18"/>
+          <w:vertAlign w:val="superscript"/>
+        </w:rPr>
+        <w:tab/>
+      </w:r>
+      <w:r>
+        <w:rPr>
+          <w:rFonts w:ascii="Courier New" w:hAnsi="Courier New" w:cs="Courier New"/>
+          <w:sz w:val="18"/>
+          <w:szCs w:val="18"/>
+          <w:vertAlign w:val="superscript"/>
+        </w:rPr>
+        <w:tab/>
+        <w:t>treatments(date);</w:t>
+      </w:r>
+    </w:p>
+    <w:p>
+      <w:pPr>
+        <w:pStyle w:val="ListParagraph"/>
+        <w:rPr>
+          <w:rFonts w:ascii="Courier New" w:hAnsi="Courier New" w:cs="Courier New"/>
+          <w:sz w:val="18"/>
+          <w:szCs w:val="18"/>
+          <w:vertAlign w:val="superscript"/>
+        </w:rPr>
+      </w:pPr>
+      <w:r>
+        <w:rPr>
+          <w:rFonts w:ascii="Courier New" w:hAnsi="Courier New" w:cs="Courier New"/>
+          <w:sz w:val="18"/>
+          <w:szCs w:val="18"/>
+          <w:vertAlign w:val="superscript"/>
+        </w:rPr>
+        <w:tab/>
+      </w:r>
+    </w:p>
+    <w:p>
+      <w:pPr>
+        <w:pStyle w:val="ListParagraph"/>
+        <w:rPr>
+          <w:rFonts w:ascii="Courier New" w:hAnsi="Courier New" w:cs="Courier New"/>
+          <w:sz w:val="18"/>
+          <w:szCs w:val="18"/>
+          <w:vertAlign w:val="superscript"/>
+        </w:rPr>
+      </w:pPr>
+      <w:r>
+        <w:rPr>
+          <w:rFonts w:ascii="Courier New" w:hAnsi="Courier New" w:cs="Courier New"/>
+          <w:sz w:val="18"/>
+          <w:szCs w:val="18"/>
+          <w:vertAlign w:val="superscript"/>
+        </w:rPr>
+        <w:tab/>
+        <w:t xml:space="preserve">CREATE INDEX </w:t>
+      </w:r>
+      <w:proofErr w:type="spellStart"/>
+      <w:r>
+        <w:rPr>
+          <w:rFonts w:ascii="Courier New" w:hAnsi="Courier New" w:cs="Courier New"/>
+          <w:sz w:val="18"/>
+          <w:szCs w:val="18"/>
+          <w:vertAlign w:val="superscript"/>
+        </w:rPr>
+        <w:t>idx_nurses_care_center_id</w:t>
+      </w:r>
+      <w:proofErr w:type="spellEnd"/>
+      <w:r>
+        <w:rPr>
+          <w:rFonts w:ascii="Courier New" w:hAnsi="Courier New" w:cs="Courier New"/>
+          <w:sz w:val="18"/>
+          <w:szCs w:val="18"/>
+          <w:vertAlign w:val="superscript"/>
+        </w:rPr>
+        <w:t xml:space="preserve"> on </w:t>
+      </w:r>
+    </w:p>
+    <w:p>
+      <w:pPr>
+        <w:pStyle w:val="ListParagraph"/>
+        <w:rPr>
+          <w:rFonts w:ascii="Courier New" w:hAnsi="Courier New" w:cs="Courier New"/>
+          <w:sz w:val="18"/>
+          <w:szCs w:val="18"/>
+          <w:vertAlign w:val="superscript"/>
+        </w:rPr>
+      </w:pPr>
+      <w:r>
+        <w:rPr>
+          <w:rFonts w:ascii="Courier New" w:hAnsi="Courier New" w:cs="Courier New"/>
+          <w:sz w:val="18"/>
+          <w:szCs w:val="18"/>
+          <w:vertAlign w:val="superscript"/>
+        </w:rPr>
+        <w:tab/>
+      </w:r>
+      <w:r>
+        <w:rPr>
+          <w:rFonts w:ascii="Courier New" w:hAnsi="Courier New" w:cs="Courier New"/>
+          <w:sz w:val="18"/>
+          <w:szCs w:val="18"/>
+          <w:vertAlign w:val="superscript"/>
+        </w:rPr>
+        <w:tab/>
+        <w:t>nurses(</w:t>
+      </w:r>
+      <w:proofErr w:type="spellStart"/>
+      <w:r>
+        <w:rPr>
+          <w:rFonts w:ascii="Courier New" w:hAnsi="Courier New" w:cs="Courier New"/>
+          <w:sz w:val="18"/>
+          <w:szCs w:val="18"/>
+          <w:vertAlign w:val="superscript"/>
+        </w:rPr>
+        <w:t>care_center_id</w:t>
+      </w:r>
+      <w:proofErr w:type="spellEnd"/>
+      <w:r>
+        <w:rPr>
+          <w:rFonts w:ascii="Courier New" w:hAnsi="Courier New" w:cs="Courier New"/>
+          <w:sz w:val="18"/>
+          <w:szCs w:val="18"/>
+          <w:vertAlign w:val="superscript"/>
+        </w:rPr>
+        <w:t>);</w:t>
+      </w:r>
+    </w:p>
+    <w:p>
+      <w:pPr>
+        <w:pStyle w:val="ListParagraph"/>
+        <w:rPr>
+          <w:rFonts w:ascii="Courier New" w:hAnsi="Courier New" w:cs="Courier New"/>
+          <w:sz w:val="18"/>
+          <w:szCs w:val="18"/>
+          <w:vertAlign w:val="superscript"/>
+        </w:rPr>
+      </w:pPr>
+      <w:r>
+        <w:rPr>
+          <w:rFonts w:ascii="Courier New" w:hAnsi="Courier New" w:cs="Courier New"/>
+          <w:sz w:val="18"/>
+          <w:szCs w:val="18"/>
+          <w:vertAlign w:val="superscript"/>
+        </w:rPr>
+        <w:tab/>
+        <w:t xml:space="preserve">CREATE INDEX </w:t>
+      </w:r>
+      <w:proofErr w:type="spellStart"/>
+      <w:r>
+        <w:rPr>
+          <w:rFonts w:ascii="Courier New" w:hAnsi="Courier New" w:cs="Courier New"/>
+          <w:sz w:val="18"/>
+          <w:szCs w:val="18"/>
+          <w:vertAlign w:val="superscript"/>
+        </w:rPr>
+        <w:t>idx_nurses_cert_type</w:t>
+      </w:r>
+      <w:proofErr w:type="spellEnd"/>
+      <w:r>
+        <w:rPr>
+          <w:rFonts w:ascii="Courier New" w:hAnsi="Courier New" w:cs="Courier New"/>
+          <w:sz w:val="18"/>
+          <w:szCs w:val="18"/>
+          <w:vertAlign w:val="superscript"/>
+        </w:rPr>
+        <w:t xml:space="preserve"> on</w:t>
+      </w:r>
+    </w:p>
+    <w:p>
+      <w:pPr>
+        <w:pStyle w:val="ListParagraph"/>
+        <w:rPr>
+          <w:rFonts w:ascii="Courier New" w:hAnsi="Courier New" w:cs="Courier New"/>
+          <w:sz w:val="18"/>
+          <w:szCs w:val="18"/>
+          <w:vertAlign w:val="superscript"/>
+        </w:rPr>
+      </w:pPr>
+      <w:r>
+        <w:rPr>
+          <w:rFonts w:ascii="Courier New" w:hAnsi="Courier New" w:cs="Courier New"/>
+          <w:sz w:val="18"/>
+          <w:szCs w:val="18"/>
+          <w:vertAlign w:val="superscript"/>
+        </w:rPr>
+        <w:tab/>
+      </w:r>
+      <w:r>
+        <w:rPr>
+          <w:rFonts w:ascii="Courier New" w:hAnsi="Courier New" w:cs="Courier New"/>
+          <w:sz w:val="18"/>
+          <w:szCs w:val="18"/>
+          <w:vertAlign w:val="superscript"/>
+        </w:rPr>
+        <w:tab/>
+        <w:t>nurses(</w:t>
+      </w:r>
+      <w:proofErr w:type="spellStart"/>
+      <w:r>
+        <w:rPr>
+          <w:rFonts w:ascii="Courier New" w:hAnsi="Courier New" w:cs="Courier New"/>
+          <w:sz w:val="18"/>
+          <w:szCs w:val="18"/>
+          <w:vertAlign w:val="superscript"/>
+        </w:rPr>
+        <w:t>certificate_type</w:t>
+      </w:r>
+      <w:proofErr w:type="spellEnd"/>
+      <w:r>
+        <w:rPr>
+          <w:rFonts w:ascii="Courier New" w:hAnsi="Courier New" w:cs="Courier New"/>
+          <w:sz w:val="18"/>
+          <w:szCs w:val="18"/>
+          <w:vertAlign w:val="superscript"/>
+        </w:rPr>
+        <w:t>);</w:t>
+      </w:r>
+    </w:p>
+    <w:p>
+      <w:pPr>
+        <w:pStyle w:val="ListParagraph"/>
+        <w:rPr>
+          <w:rFonts w:ascii="Courier New" w:hAnsi="Courier New" w:cs="Courier New"/>
+          <w:sz w:val="18"/>
+          <w:szCs w:val="18"/>
+          <w:vertAlign w:val="superscript"/>
+        </w:rPr>
+      </w:pPr>
+      <w:r>
+        <w:rPr>
+          <w:rFonts w:ascii="Courier New" w:hAnsi="Courier New" w:cs="Courier New"/>
+          <w:sz w:val="18"/>
+          <w:szCs w:val="18"/>
+          <w:vertAlign w:val="superscript"/>
+        </w:rPr>
+        <w:tab/>
+      </w:r>
+    </w:p>
+    <w:p>
+      <w:pPr>
+        <w:pStyle w:val="Heading3"/>
+        <w:numPr>
+          <w:ilvl w:val="0"/>
+          <w:numId w:val="4"/>
+        </w:numPr>
+      </w:pPr>
+      <w:r>
+        <w:t xml:space="preserve">Populate these tables with some sample data and write SQL queries that show the content of each table after entering the data. (6 marks) </w:t>
+      </w:r>
+    </w:p>
     <w:p/>
     <w:p>
       <w:pPr>
+        <w:pStyle w:val="ListParagraph"/>
+        <w:rPr>
+          <w:rFonts w:ascii="Courier New" w:hAnsi="Courier New" w:cs="Courier New"/>
+          <w:sz w:val="12"/>
+          <w:szCs w:val="12"/>
+        </w:rPr>
+      </w:pPr>
+      <w:r>
+        <w:rPr>
+          <w:rFonts w:ascii="Courier New" w:hAnsi="Courier New" w:cs="Courier New"/>
+          <w:sz w:val="12"/>
+          <w:szCs w:val="12"/>
+        </w:rPr>
+        <w:t>--- *************************************************************************************************</w:t>
+      </w:r>
+    </w:p>
+    <w:p>
+      <w:pPr>
+        <w:pStyle w:val="ListParagraph"/>
+        <w:rPr>
+          <w:rFonts w:ascii="Courier New" w:hAnsi="Courier New" w:cs="Courier New"/>
+          <w:sz w:val="12"/>
+          <w:szCs w:val="12"/>
+        </w:rPr>
+      </w:pPr>
+      <w:r>
+        <w:rPr>
+          <w:rFonts w:ascii="Courier New" w:hAnsi="Courier New" w:cs="Courier New"/>
+          <w:sz w:val="12"/>
+          <w:szCs w:val="12"/>
+        </w:rPr>
+        <w:t>--- ***         INSERT STATEMENTS                                                                 ***</w:t>
+      </w:r>
+    </w:p>
+    <w:p>
+      <w:pPr>
+        <w:pStyle w:val="ListParagraph"/>
+        <w:rPr>
+          <w:rFonts w:ascii="Courier New" w:hAnsi="Courier New" w:cs="Courier New"/>
+          <w:sz w:val="12"/>
+          <w:szCs w:val="12"/>
+        </w:rPr>
+      </w:pPr>
+      <w:r>
+        <w:rPr>
+          <w:rFonts w:ascii="Courier New" w:hAnsi="Courier New" w:cs="Courier New"/>
+          <w:sz w:val="12"/>
+          <w:szCs w:val="12"/>
+        </w:rPr>
+        <w:t>--- ***                        update statements are below                                        ***</w:t>
+      </w:r>
+    </w:p>
+    <w:p>
+      <w:pPr>
+        <w:pStyle w:val="ListParagraph"/>
+        <w:rPr>
+          <w:rFonts w:ascii="Courier New" w:hAnsi="Courier New" w:cs="Courier New"/>
+          <w:sz w:val="12"/>
+          <w:szCs w:val="12"/>
+        </w:rPr>
+      </w:pPr>
+      <w:r>
+        <w:rPr>
+          <w:rFonts w:ascii="Courier New" w:hAnsi="Courier New" w:cs="Courier New"/>
+          <w:sz w:val="12"/>
+          <w:szCs w:val="12"/>
+        </w:rPr>
+        <w:t>--- *************************************************************************************************</w:t>
+      </w:r>
+    </w:p>
+    <w:p>
+      <w:pPr>
+        <w:pStyle w:val="ListParagraph"/>
+        <w:rPr>
+          <w:rFonts w:ascii="Courier New" w:hAnsi="Courier New" w:cs="Courier New"/>
+          <w:sz w:val="12"/>
+          <w:szCs w:val="12"/>
+        </w:rPr>
+      </w:pPr>
+    </w:p>
+    <w:p>
+      <w:pPr>
+        <w:pStyle w:val="ListParagraph"/>
+        <w:rPr>
+          <w:rFonts w:ascii="Courier New" w:hAnsi="Courier New" w:cs="Courier New"/>
+          <w:sz w:val="12"/>
+          <w:szCs w:val="12"/>
+        </w:rPr>
+      </w:pPr>
+      <w:r>
+        <w:rPr>
+          <w:rFonts w:ascii="Courier New" w:hAnsi="Courier New" w:cs="Courier New"/>
+          <w:sz w:val="12"/>
+          <w:szCs w:val="12"/>
+        </w:rPr>
+        <w:t>-- physicians:</w:t>
+      </w:r>
+    </w:p>
+    <w:p>
+      <w:pPr>
+        <w:pStyle w:val="ListParagraph"/>
+        <w:rPr>
+          <w:rFonts w:ascii="Courier New" w:hAnsi="Courier New" w:cs="Courier New"/>
+          <w:sz w:val="12"/>
+          <w:szCs w:val="12"/>
+        </w:rPr>
+      </w:pPr>
+      <w:r>
+        <w:rPr>
+          <w:rFonts w:ascii="Courier New" w:hAnsi="Courier New" w:cs="Courier New"/>
+          <w:sz w:val="12"/>
+          <w:szCs w:val="12"/>
+        </w:rPr>
+        <w:t xml:space="preserve">INSERT INTO physicians (name, </w:t>
+      </w:r>
+      <w:proofErr w:type="spellStart"/>
+      <w:r>
+        <w:rPr>
+          <w:rFonts w:ascii="Courier New" w:hAnsi="Courier New" w:cs="Courier New"/>
+          <w:sz w:val="12"/>
+          <w:szCs w:val="12"/>
+        </w:rPr>
+        <w:t>pager_number</w:t>
+      </w:r>
+      <w:proofErr w:type="spellEnd"/>
+      <w:r>
+        <w:rPr>
+          <w:rFonts w:ascii="Courier New" w:hAnsi="Courier New" w:cs="Courier New"/>
+          <w:sz w:val="12"/>
+          <w:szCs w:val="12"/>
+        </w:rPr>
+        <w:t>, specialization, salary)</w:t>
+      </w:r>
+    </w:p>
+    <w:p>
+      <w:pPr>
+        <w:pStyle w:val="ListParagraph"/>
+        <w:rPr>
+          <w:rFonts w:ascii="Courier New" w:hAnsi="Courier New" w:cs="Courier New"/>
+          <w:sz w:val="12"/>
+          <w:szCs w:val="12"/>
+        </w:rPr>
+      </w:pPr>
+      <w:r>
+        <w:rPr>
+          <w:rFonts w:ascii="Courier New" w:hAnsi="Courier New" w:cs="Courier New"/>
+          <w:sz w:val="12"/>
+          <w:szCs w:val="12"/>
+        </w:rPr>
+        <w:t>VALUES ('Dr. Alice Morgan', '613-555-2010', 'Cardiology', 185000);</w:t>
+      </w:r>
+    </w:p>
+    <w:p>
+      <w:pPr>
+        <w:pStyle w:val="ListParagraph"/>
+        <w:rPr>
+          <w:rFonts w:ascii="Courier New" w:hAnsi="Courier New" w:cs="Courier New"/>
+          <w:sz w:val="12"/>
+          <w:szCs w:val="12"/>
+        </w:rPr>
+      </w:pPr>
+    </w:p>
+    <w:p>
+      <w:pPr>
+        <w:pStyle w:val="ListParagraph"/>
+        <w:rPr>
+          <w:rFonts w:ascii="Courier New" w:hAnsi="Courier New" w:cs="Courier New"/>
+          <w:sz w:val="12"/>
+          <w:szCs w:val="12"/>
+        </w:rPr>
+      </w:pPr>
+      <w:r>
+        <w:rPr>
+          <w:rFonts w:ascii="Courier New" w:hAnsi="Courier New" w:cs="Courier New"/>
+          <w:sz w:val="12"/>
+          <w:szCs w:val="12"/>
+        </w:rPr>
+        <w:t xml:space="preserve">INSERT INTO physicians (name, </w:t>
+      </w:r>
+      <w:proofErr w:type="spellStart"/>
+      <w:r>
+        <w:rPr>
+          <w:rFonts w:ascii="Courier New" w:hAnsi="Courier New" w:cs="Courier New"/>
+          <w:sz w:val="12"/>
+          <w:szCs w:val="12"/>
+        </w:rPr>
+        <w:t>pager_number</w:t>
+      </w:r>
+      <w:proofErr w:type="spellEnd"/>
+      <w:r>
+        <w:rPr>
+          <w:rFonts w:ascii="Courier New" w:hAnsi="Courier New" w:cs="Courier New"/>
+          <w:sz w:val="12"/>
+          <w:szCs w:val="12"/>
+        </w:rPr>
+        <w:t>, specialization, salary)</w:t>
+      </w:r>
+    </w:p>
+    <w:p>
+      <w:pPr>
+        <w:pStyle w:val="ListParagraph"/>
+        <w:rPr>
+          <w:rFonts w:ascii="Courier New" w:hAnsi="Courier New" w:cs="Courier New"/>
+          <w:sz w:val="12"/>
+          <w:szCs w:val="12"/>
+        </w:rPr>
+      </w:pPr>
+      <w:r>
+        <w:rPr>
+          <w:rFonts w:ascii="Courier New" w:hAnsi="Courier New" w:cs="Courier New"/>
+          <w:sz w:val="12"/>
+          <w:szCs w:val="12"/>
+        </w:rPr>
+        <w:t>VALUES ('Dr. Brian Chen', '613-555-2020', 'Neurology', 192000);</w:t>
+      </w:r>
+    </w:p>
+    <w:p>
+      <w:pPr>
+        <w:pStyle w:val="ListParagraph"/>
+        <w:rPr>
+          <w:rFonts w:ascii="Courier New" w:hAnsi="Courier New" w:cs="Courier New"/>
+          <w:sz w:val="12"/>
+          <w:szCs w:val="12"/>
+        </w:rPr>
+      </w:pPr>
+    </w:p>
+    <w:p>
+      <w:pPr>
+        <w:pStyle w:val="ListParagraph"/>
+        <w:rPr>
+          <w:rFonts w:ascii="Courier New" w:hAnsi="Courier New" w:cs="Courier New"/>
+          <w:sz w:val="12"/>
+          <w:szCs w:val="12"/>
+        </w:rPr>
+      </w:pPr>
+      <w:r>
+        <w:rPr>
+          <w:rFonts w:ascii="Courier New" w:hAnsi="Courier New" w:cs="Courier New"/>
+          <w:sz w:val="12"/>
+          <w:szCs w:val="12"/>
+        </w:rPr>
+        <w:t xml:space="preserve">INSERT INTO physicians (name, </w:t>
+      </w:r>
+      <w:proofErr w:type="spellStart"/>
+      <w:r>
+        <w:rPr>
+          <w:rFonts w:ascii="Courier New" w:hAnsi="Courier New" w:cs="Courier New"/>
+          <w:sz w:val="12"/>
+          <w:szCs w:val="12"/>
+        </w:rPr>
+        <w:t>pager_number</w:t>
+      </w:r>
+      <w:proofErr w:type="spellEnd"/>
+      <w:r>
+        <w:rPr>
+          <w:rFonts w:ascii="Courier New" w:hAnsi="Courier New" w:cs="Courier New"/>
+          <w:sz w:val="12"/>
+          <w:szCs w:val="12"/>
+        </w:rPr>
+        <w:t>, specialization, salary)</w:t>
+      </w:r>
+    </w:p>
+    <w:p>
+      <w:pPr>
+        <w:pStyle w:val="ListParagraph"/>
+        <w:rPr>
+          <w:rFonts w:ascii="Courier New" w:hAnsi="Courier New" w:cs="Courier New"/>
+          <w:sz w:val="12"/>
+          <w:szCs w:val="12"/>
+        </w:rPr>
+      </w:pPr>
+      <w:r>
+        <w:rPr>
+          <w:rFonts w:ascii="Courier New" w:hAnsi="Courier New" w:cs="Courier New"/>
+          <w:sz w:val="12"/>
+          <w:szCs w:val="12"/>
+        </w:rPr>
+        <w:t>VALUES ('Dr. Sarah Patel', '613-555-2030', 'Orthopedics', 178000);</w:t>
+      </w:r>
+    </w:p>
+    <w:p>
+      <w:pPr>
+        <w:pStyle w:val="ListParagraph"/>
+        <w:rPr>
+          <w:rFonts w:ascii="Courier New" w:hAnsi="Courier New" w:cs="Courier New"/>
+          <w:sz w:val="12"/>
+          <w:szCs w:val="12"/>
+        </w:rPr>
+      </w:pPr>
+    </w:p>
+    <w:p>
+      <w:pPr>
+        <w:pStyle w:val="ListParagraph"/>
+        <w:rPr>
+          <w:rFonts w:ascii="Courier New" w:hAnsi="Courier New" w:cs="Courier New"/>
+          <w:sz w:val="12"/>
+          <w:szCs w:val="12"/>
+        </w:rPr>
+      </w:pPr>
+      <w:r>
+        <w:rPr>
+          <w:rFonts w:ascii="Courier New" w:hAnsi="Courier New" w:cs="Courier New"/>
+          <w:sz w:val="12"/>
+          <w:szCs w:val="12"/>
+        </w:rPr>
+        <w:t>--- car centers:</w:t>
+      </w:r>
+    </w:p>
+    <w:p>
+      <w:pPr>
+        <w:pStyle w:val="ListParagraph"/>
+        <w:rPr>
+          <w:rFonts w:ascii="Courier New" w:hAnsi="Courier New" w:cs="Courier New"/>
+          <w:sz w:val="12"/>
+          <w:szCs w:val="12"/>
+        </w:rPr>
+      </w:pPr>
+      <w:r>
+        <w:rPr>
+          <w:rFonts w:ascii="Courier New" w:hAnsi="Courier New" w:cs="Courier New"/>
+          <w:sz w:val="12"/>
+          <w:szCs w:val="12"/>
+        </w:rPr>
+        <w:t xml:space="preserve">INSERT INTO </w:t>
+      </w:r>
+      <w:proofErr w:type="spellStart"/>
+      <w:r>
+        <w:rPr>
+          <w:rFonts w:ascii="Courier New" w:hAnsi="Courier New" w:cs="Courier New"/>
+          <w:sz w:val="12"/>
+          <w:szCs w:val="12"/>
+        </w:rPr>
+        <w:t>care_centers</w:t>
+      </w:r>
+      <w:proofErr w:type="spellEnd"/>
+      <w:r>
+        <w:rPr>
+          <w:rFonts w:ascii="Courier New" w:hAnsi="Courier New" w:cs="Courier New"/>
+          <w:sz w:val="12"/>
+          <w:szCs w:val="12"/>
+        </w:rPr>
+        <w:t xml:space="preserve"> (name, location, </w:t>
+      </w:r>
+      <w:proofErr w:type="spellStart"/>
+      <w:r>
+        <w:rPr>
+          <w:rFonts w:ascii="Courier New" w:hAnsi="Courier New" w:cs="Courier New"/>
+          <w:sz w:val="12"/>
+          <w:szCs w:val="12"/>
+        </w:rPr>
+        <w:t>nurse_charge_id</w:t>
+      </w:r>
+      <w:proofErr w:type="spellEnd"/>
+      <w:r>
+        <w:rPr>
+          <w:rFonts w:ascii="Courier New" w:hAnsi="Courier New" w:cs="Courier New"/>
+          <w:sz w:val="12"/>
+          <w:szCs w:val="12"/>
+        </w:rPr>
+        <w:t>)</w:t>
+      </w:r>
+    </w:p>
+    <w:p>
+      <w:pPr>
+        <w:pStyle w:val="ListParagraph"/>
+        <w:rPr>
+          <w:rFonts w:ascii="Courier New" w:hAnsi="Courier New" w:cs="Courier New"/>
+          <w:sz w:val="12"/>
+          <w:szCs w:val="12"/>
+        </w:rPr>
+      </w:pPr>
+      <w:r>
+        <w:rPr>
+          <w:rFonts w:ascii="Courier New" w:hAnsi="Courier New" w:cs="Courier New"/>
+          <w:sz w:val="12"/>
+          <w:szCs w:val="12"/>
+        </w:rPr>
+        <w:t>VALUES ('Riverside Clinic', 'Riverside South', NULL);</w:t>
+      </w:r>
+    </w:p>
+    <w:p>
+      <w:pPr>
+        <w:pStyle w:val="ListParagraph"/>
+        <w:rPr>
+          <w:rFonts w:ascii="Courier New" w:hAnsi="Courier New" w:cs="Courier New"/>
+          <w:sz w:val="12"/>
+          <w:szCs w:val="12"/>
+        </w:rPr>
+      </w:pPr>
+    </w:p>
+    <w:p>
+      <w:pPr>
+        <w:pStyle w:val="ListParagraph"/>
+        <w:rPr>
+          <w:rFonts w:ascii="Courier New" w:hAnsi="Courier New" w:cs="Courier New"/>
+          <w:sz w:val="12"/>
+          <w:szCs w:val="12"/>
+        </w:rPr>
+      </w:pPr>
+      <w:r>
+        <w:rPr>
+          <w:rFonts w:ascii="Courier New" w:hAnsi="Courier New" w:cs="Courier New"/>
+          <w:sz w:val="12"/>
+          <w:szCs w:val="12"/>
+        </w:rPr>
+        <w:t xml:space="preserve">INSERT INTO </w:t>
+      </w:r>
+      <w:proofErr w:type="spellStart"/>
+      <w:r>
+        <w:rPr>
+          <w:rFonts w:ascii="Courier New" w:hAnsi="Courier New" w:cs="Courier New"/>
+          <w:sz w:val="12"/>
+          <w:szCs w:val="12"/>
+        </w:rPr>
+        <w:t>care_centers</w:t>
+      </w:r>
+      <w:proofErr w:type="spellEnd"/>
+      <w:r>
+        <w:rPr>
+          <w:rFonts w:ascii="Courier New" w:hAnsi="Courier New" w:cs="Courier New"/>
+          <w:sz w:val="12"/>
+          <w:szCs w:val="12"/>
+        </w:rPr>
+        <w:t xml:space="preserve"> (name, location, </w:t>
+      </w:r>
+      <w:proofErr w:type="spellStart"/>
+      <w:r>
+        <w:rPr>
+          <w:rFonts w:ascii="Courier New" w:hAnsi="Courier New" w:cs="Courier New"/>
+          <w:sz w:val="12"/>
+          <w:szCs w:val="12"/>
+        </w:rPr>
+        <w:t>nurse_charge_id</w:t>
+      </w:r>
+      <w:proofErr w:type="spellEnd"/>
+      <w:r>
+        <w:rPr>
+          <w:rFonts w:ascii="Courier New" w:hAnsi="Courier New" w:cs="Courier New"/>
+          <w:sz w:val="12"/>
+          <w:szCs w:val="12"/>
+        </w:rPr>
+        <w:t>)</w:t>
+      </w:r>
+    </w:p>
+    <w:p>
+      <w:pPr>
+        <w:pStyle w:val="ListParagraph"/>
+        <w:rPr>
+          <w:rFonts w:ascii="Courier New" w:hAnsi="Courier New" w:cs="Courier New"/>
+          <w:sz w:val="12"/>
+          <w:szCs w:val="12"/>
+        </w:rPr>
+      </w:pPr>
+      <w:r>
+        <w:rPr>
+          <w:rFonts w:ascii="Courier New" w:hAnsi="Courier New" w:cs="Courier New"/>
+          <w:sz w:val="12"/>
+          <w:szCs w:val="12"/>
+        </w:rPr>
+        <w:t>VALUES ('Maple Health Unit', 'Barrhaven', NULL);</w:t>
+      </w:r>
+    </w:p>
+    <w:p>
+      <w:pPr>
+        <w:pStyle w:val="ListParagraph"/>
+        <w:rPr>
+          <w:rFonts w:ascii="Courier New" w:hAnsi="Courier New" w:cs="Courier New"/>
+          <w:sz w:val="12"/>
+          <w:szCs w:val="12"/>
+        </w:rPr>
+      </w:pPr>
+    </w:p>
+    <w:p>
+      <w:pPr>
+        <w:pStyle w:val="ListParagraph"/>
+        <w:rPr>
+          <w:rFonts w:ascii="Courier New" w:hAnsi="Courier New" w:cs="Courier New"/>
+          <w:sz w:val="12"/>
+          <w:szCs w:val="12"/>
+        </w:rPr>
+      </w:pPr>
+      <w:r>
+        <w:rPr>
+          <w:rFonts w:ascii="Courier New" w:hAnsi="Courier New" w:cs="Courier New"/>
+          <w:sz w:val="12"/>
+          <w:szCs w:val="12"/>
+        </w:rPr>
+        <w:t xml:space="preserve">INSERT INTO </w:t>
+      </w:r>
+      <w:proofErr w:type="spellStart"/>
+      <w:r>
+        <w:rPr>
+          <w:rFonts w:ascii="Courier New" w:hAnsi="Courier New" w:cs="Courier New"/>
+          <w:sz w:val="12"/>
+          <w:szCs w:val="12"/>
+        </w:rPr>
+        <w:t>care_centers</w:t>
+      </w:r>
+      <w:proofErr w:type="spellEnd"/>
+      <w:r>
+        <w:rPr>
+          <w:rFonts w:ascii="Courier New" w:hAnsi="Courier New" w:cs="Courier New"/>
+          <w:sz w:val="12"/>
+          <w:szCs w:val="12"/>
+        </w:rPr>
+        <w:t xml:space="preserve"> (name, location, </w:t>
+      </w:r>
+      <w:proofErr w:type="spellStart"/>
+      <w:r>
+        <w:rPr>
+          <w:rFonts w:ascii="Courier New" w:hAnsi="Courier New" w:cs="Courier New"/>
+          <w:sz w:val="12"/>
+          <w:szCs w:val="12"/>
+        </w:rPr>
+        <w:t>nurse_charge_id</w:t>
+      </w:r>
+      <w:proofErr w:type="spellEnd"/>
+      <w:r>
+        <w:rPr>
+          <w:rFonts w:ascii="Courier New" w:hAnsi="Courier New" w:cs="Courier New"/>
+          <w:sz w:val="12"/>
+          <w:szCs w:val="12"/>
+        </w:rPr>
+        <w:t>)</w:t>
+      </w:r>
+    </w:p>
+    <w:p>
+      <w:pPr>
+        <w:pStyle w:val="ListParagraph"/>
+        <w:rPr>
+          <w:rFonts w:ascii="Courier New" w:hAnsi="Courier New" w:cs="Courier New"/>
+          <w:sz w:val="12"/>
+          <w:szCs w:val="12"/>
+        </w:rPr>
+      </w:pPr>
+      <w:r>
+        <w:rPr>
+          <w:rFonts w:ascii="Courier New" w:hAnsi="Courier New" w:cs="Courier New"/>
+          <w:sz w:val="12"/>
+          <w:szCs w:val="12"/>
+        </w:rPr>
+        <w:t>VALUES ('Capital Care Centre', 'Orleans', NULL);</w:t>
+      </w:r>
+    </w:p>
+    <w:p>
+      <w:pPr>
+        <w:pStyle w:val="ListParagraph"/>
+        <w:rPr>
+          <w:rFonts w:ascii="Courier New" w:hAnsi="Courier New" w:cs="Courier New"/>
+          <w:sz w:val="12"/>
+          <w:szCs w:val="12"/>
+        </w:rPr>
+      </w:pPr>
+    </w:p>
+    <w:p>
+      <w:pPr>
+        <w:pStyle w:val="ListParagraph"/>
+        <w:rPr>
+          <w:rFonts w:ascii="Courier New" w:hAnsi="Courier New" w:cs="Courier New"/>
+          <w:sz w:val="12"/>
+          <w:szCs w:val="12"/>
+        </w:rPr>
+      </w:pPr>
+      <w:r>
+        <w:rPr>
+          <w:rFonts w:ascii="Courier New" w:hAnsi="Courier New" w:cs="Courier New"/>
+          <w:sz w:val="12"/>
+          <w:szCs w:val="12"/>
+        </w:rPr>
+        <w:t>--- Nurses:</w:t>
+      </w:r>
+    </w:p>
+    <w:p>
+      <w:pPr>
+        <w:pStyle w:val="ListParagraph"/>
+        <w:rPr>
+          <w:rFonts w:ascii="Courier New" w:hAnsi="Courier New" w:cs="Courier New"/>
+          <w:sz w:val="12"/>
+          <w:szCs w:val="12"/>
+        </w:rPr>
+      </w:pPr>
+      <w:r>
+        <w:rPr>
+          <w:rFonts w:ascii="Courier New" w:hAnsi="Courier New" w:cs="Courier New"/>
+          <w:sz w:val="12"/>
+          <w:szCs w:val="12"/>
+        </w:rPr>
+        <w:t xml:space="preserve">INSERT INTO nurses (name, </w:t>
+      </w:r>
+      <w:proofErr w:type="spellStart"/>
+      <w:r>
+        <w:rPr>
+          <w:rFonts w:ascii="Courier New" w:hAnsi="Courier New" w:cs="Courier New"/>
+          <w:sz w:val="12"/>
+          <w:szCs w:val="12"/>
+        </w:rPr>
+        <w:t>care_center_id</w:t>
+      </w:r>
+      <w:proofErr w:type="spellEnd"/>
+      <w:r>
+        <w:rPr>
+          <w:rFonts w:ascii="Courier New" w:hAnsi="Courier New" w:cs="Courier New"/>
+          <w:sz w:val="12"/>
+          <w:szCs w:val="12"/>
+        </w:rPr>
+        <w:t xml:space="preserve">, </w:t>
+      </w:r>
+      <w:proofErr w:type="spellStart"/>
+      <w:r>
+        <w:rPr>
+          <w:rFonts w:ascii="Courier New" w:hAnsi="Courier New" w:cs="Courier New"/>
+          <w:sz w:val="12"/>
+          <w:szCs w:val="12"/>
+        </w:rPr>
+        <w:t>certificate_type</w:t>
+      </w:r>
+      <w:proofErr w:type="spellEnd"/>
+      <w:r>
+        <w:rPr>
+          <w:rFonts w:ascii="Courier New" w:hAnsi="Courier New" w:cs="Courier New"/>
+          <w:sz w:val="12"/>
+          <w:szCs w:val="12"/>
+        </w:rPr>
+        <w:t>, telephone, salary)</w:t>
+      </w:r>
+    </w:p>
+    <w:p>
+      <w:pPr>
+        <w:pStyle w:val="ListParagraph"/>
+        <w:rPr>
+          <w:rFonts w:ascii="Courier New" w:hAnsi="Courier New" w:cs="Courier New"/>
+          <w:sz w:val="12"/>
+          <w:szCs w:val="12"/>
+        </w:rPr>
+      </w:pPr>
+      <w:r>
+        <w:rPr>
+          <w:rFonts w:ascii="Courier New" w:hAnsi="Courier New" w:cs="Courier New"/>
+          <w:sz w:val="12"/>
+          <w:szCs w:val="12"/>
+        </w:rPr>
+        <w:t>VALUES ('Nurse Emily Ross', 1, 'RN', '613-555-3010', 82000);</w:t>
+      </w:r>
+    </w:p>
+    <w:p>
+      <w:pPr>
+        <w:pStyle w:val="ListParagraph"/>
+        <w:rPr>
+          <w:rFonts w:ascii="Courier New" w:hAnsi="Courier New" w:cs="Courier New"/>
+          <w:sz w:val="12"/>
+          <w:szCs w:val="12"/>
+        </w:rPr>
+      </w:pPr>
+    </w:p>
+    <w:p>
+      <w:pPr>
+        <w:pStyle w:val="ListParagraph"/>
+        <w:rPr>
+          <w:rFonts w:ascii="Courier New" w:hAnsi="Courier New" w:cs="Courier New"/>
+          <w:sz w:val="12"/>
+          <w:szCs w:val="12"/>
+        </w:rPr>
+      </w:pPr>
+      <w:r>
+        <w:rPr>
+          <w:rFonts w:ascii="Courier New" w:hAnsi="Courier New" w:cs="Courier New"/>
+          <w:sz w:val="12"/>
+          <w:szCs w:val="12"/>
+        </w:rPr>
+        <w:t xml:space="preserve">INSERT INTO nurses (name, </w:t>
+      </w:r>
+      <w:proofErr w:type="spellStart"/>
+      <w:r>
+        <w:rPr>
+          <w:rFonts w:ascii="Courier New" w:hAnsi="Courier New" w:cs="Courier New"/>
+          <w:sz w:val="12"/>
+          <w:szCs w:val="12"/>
+        </w:rPr>
+        <w:t>care_center_id</w:t>
+      </w:r>
+      <w:proofErr w:type="spellEnd"/>
+      <w:r>
+        <w:rPr>
+          <w:rFonts w:ascii="Courier New" w:hAnsi="Courier New" w:cs="Courier New"/>
+          <w:sz w:val="12"/>
+          <w:szCs w:val="12"/>
+        </w:rPr>
+        <w:t xml:space="preserve">, </w:t>
+      </w:r>
+      <w:proofErr w:type="spellStart"/>
+      <w:r>
+        <w:rPr>
+          <w:rFonts w:ascii="Courier New" w:hAnsi="Courier New" w:cs="Courier New"/>
+          <w:sz w:val="12"/>
+          <w:szCs w:val="12"/>
+        </w:rPr>
+        <w:t>certificate_type</w:t>
+      </w:r>
+      <w:proofErr w:type="spellEnd"/>
+      <w:r>
+        <w:rPr>
+          <w:rFonts w:ascii="Courier New" w:hAnsi="Courier New" w:cs="Courier New"/>
+          <w:sz w:val="12"/>
+          <w:szCs w:val="12"/>
+        </w:rPr>
+        <w:t>, telephone, salary)</w:t>
+      </w:r>
+    </w:p>
+    <w:p>
+      <w:pPr>
+        <w:pStyle w:val="ListParagraph"/>
+        <w:rPr>
+          <w:rFonts w:ascii="Courier New" w:hAnsi="Courier New" w:cs="Courier New"/>
+          <w:sz w:val="12"/>
+          <w:szCs w:val="12"/>
+        </w:rPr>
+      </w:pPr>
+      <w:r>
+        <w:rPr>
+          <w:rFonts w:ascii="Courier New" w:hAnsi="Courier New" w:cs="Courier New"/>
+          <w:sz w:val="12"/>
+          <w:szCs w:val="12"/>
+        </w:rPr>
+        <w:t>VALUES ('Nurse Jacob Hill', 2, 'RPN', '613-555-3020', 76000);</w:t>
+      </w:r>
+    </w:p>
+    <w:p>
+      <w:pPr>
+        <w:pStyle w:val="ListParagraph"/>
+        <w:rPr>
+          <w:rFonts w:ascii="Courier New" w:hAnsi="Courier New" w:cs="Courier New"/>
+          <w:sz w:val="12"/>
+          <w:szCs w:val="12"/>
+        </w:rPr>
+      </w:pPr>
+    </w:p>
+    <w:p>
+      <w:pPr>
+        <w:pStyle w:val="ListParagraph"/>
+        <w:rPr>
+          <w:rFonts w:ascii="Courier New" w:hAnsi="Courier New" w:cs="Courier New"/>
+          <w:sz w:val="12"/>
+          <w:szCs w:val="12"/>
+        </w:rPr>
+      </w:pPr>
+      <w:r>
+        <w:rPr>
+          <w:rFonts w:ascii="Courier New" w:hAnsi="Courier New" w:cs="Courier New"/>
+          <w:sz w:val="12"/>
+          <w:szCs w:val="12"/>
+        </w:rPr>
+        <w:t xml:space="preserve">INSERT INTO nurses (name, </w:t>
+      </w:r>
+      <w:proofErr w:type="spellStart"/>
+      <w:r>
+        <w:rPr>
+          <w:rFonts w:ascii="Courier New" w:hAnsi="Courier New" w:cs="Courier New"/>
+          <w:sz w:val="12"/>
+          <w:szCs w:val="12"/>
+        </w:rPr>
+        <w:t>care_center_id</w:t>
+      </w:r>
+      <w:proofErr w:type="spellEnd"/>
+      <w:r>
+        <w:rPr>
+          <w:rFonts w:ascii="Courier New" w:hAnsi="Courier New" w:cs="Courier New"/>
+          <w:sz w:val="12"/>
+          <w:szCs w:val="12"/>
+        </w:rPr>
+        <w:t xml:space="preserve">, </w:t>
+      </w:r>
+      <w:proofErr w:type="spellStart"/>
+      <w:r>
+        <w:rPr>
+          <w:rFonts w:ascii="Courier New" w:hAnsi="Courier New" w:cs="Courier New"/>
+          <w:sz w:val="12"/>
+          <w:szCs w:val="12"/>
+        </w:rPr>
+        <w:t>certificate_type</w:t>
+      </w:r>
+      <w:proofErr w:type="spellEnd"/>
+      <w:r>
+        <w:rPr>
+          <w:rFonts w:ascii="Courier New" w:hAnsi="Courier New" w:cs="Courier New"/>
+          <w:sz w:val="12"/>
+          <w:szCs w:val="12"/>
+        </w:rPr>
+        <w:t>, telephone, salary)</w:t>
+      </w:r>
+    </w:p>
+    <w:p>
+      <w:pPr>
+        <w:pStyle w:val="ListParagraph"/>
+        <w:rPr>
+          <w:rFonts w:ascii="Courier New" w:hAnsi="Courier New" w:cs="Courier New"/>
+          <w:sz w:val="12"/>
+          <w:szCs w:val="12"/>
+        </w:rPr>
+      </w:pPr>
+      <w:r>
+        <w:rPr>
+          <w:rFonts w:ascii="Courier New" w:hAnsi="Courier New" w:cs="Courier New"/>
+          <w:sz w:val="12"/>
+          <w:szCs w:val="12"/>
+        </w:rPr>
+        <w:t>VALUES ('Nurse Olivia Grant', 3, 'RN', '613-555-3030', 83000);</w:t>
+      </w:r>
+    </w:p>
+    <w:p>
+      <w:pPr>
+        <w:pStyle w:val="ListParagraph"/>
+        <w:rPr>
+          <w:rFonts w:ascii="Courier New" w:hAnsi="Courier New" w:cs="Courier New"/>
+          <w:sz w:val="12"/>
+          <w:szCs w:val="12"/>
+        </w:rPr>
+      </w:pPr>
+    </w:p>
+    <w:p>
+      <w:pPr>
+        <w:pStyle w:val="ListParagraph"/>
+        <w:rPr>
+          <w:rFonts w:ascii="Courier New" w:hAnsi="Courier New" w:cs="Courier New"/>
+          <w:sz w:val="12"/>
+          <w:szCs w:val="12"/>
+        </w:rPr>
+      </w:pPr>
+      <w:r>
+        <w:rPr>
+          <w:rFonts w:ascii="Courier New" w:hAnsi="Courier New" w:cs="Courier New"/>
+          <w:sz w:val="12"/>
+          <w:szCs w:val="12"/>
+        </w:rPr>
+        <w:lastRenderedPageBreak/>
+        <w:t>--- Reference fixes:</w:t>
+      </w:r>
+    </w:p>
+    <w:p>
+      <w:pPr>
+        <w:pStyle w:val="ListParagraph"/>
+        <w:rPr>
+          <w:rFonts w:ascii="Courier New" w:hAnsi="Courier New" w:cs="Courier New"/>
+          <w:sz w:val="12"/>
+          <w:szCs w:val="12"/>
+        </w:rPr>
+      </w:pPr>
+      <w:r>
+        <w:rPr>
+          <w:rFonts w:ascii="Courier New" w:hAnsi="Courier New" w:cs="Courier New"/>
+          <w:sz w:val="12"/>
+          <w:szCs w:val="12"/>
+        </w:rPr>
+        <w:t xml:space="preserve">UPDATE </w:t>
+      </w:r>
+      <w:proofErr w:type="spellStart"/>
+      <w:r>
+        <w:rPr>
+          <w:rFonts w:ascii="Courier New" w:hAnsi="Courier New" w:cs="Courier New"/>
+          <w:sz w:val="12"/>
+          <w:szCs w:val="12"/>
+        </w:rPr>
+        <w:t>care_centers</w:t>
+      </w:r>
+      <w:proofErr w:type="spellEnd"/>
+      <w:r>
+        <w:rPr>
+          <w:rFonts w:ascii="Courier New" w:hAnsi="Courier New" w:cs="Courier New"/>
+          <w:sz w:val="12"/>
+          <w:szCs w:val="12"/>
+        </w:rPr>
+        <w:t xml:space="preserve"> SET </w:t>
+      </w:r>
+      <w:proofErr w:type="spellStart"/>
+      <w:r>
+        <w:rPr>
+          <w:rFonts w:ascii="Courier New" w:hAnsi="Courier New" w:cs="Courier New"/>
+          <w:sz w:val="12"/>
+          <w:szCs w:val="12"/>
+        </w:rPr>
+        <w:t>nurse_charge_id</w:t>
+      </w:r>
+      <w:proofErr w:type="spellEnd"/>
+      <w:r>
+        <w:rPr>
+          <w:rFonts w:ascii="Courier New" w:hAnsi="Courier New" w:cs="Courier New"/>
+          <w:sz w:val="12"/>
+          <w:szCs w:val="12"/>
+        </w:rPr>
+        <w:t xml:space="preserve"> = 1 WHERE </w:t>
+      </w:r>
+      <w:proofErr w:type="spellStart"/>
+      <w:r>
+        <w:rPr>
+          <w:rFonts w:ascii="Courier New" w:hAnsi="Courier New" w:cs="Courier New"/>
+          <w:sz w:val="12"/>
+          <w:szCs w:val="12"/>
+        </w:rPr>
+        <w:t>cid</w:t>
+      </w:r>
+      <w:proofErr w:type="spellEnd"/>
+      <w:r>
+        <w:rPr>
+          <w:rFonts w:ascii="Courier New" w:hAnsi="Courier New" w:cs="Courier New"/>
+          <w:sz w:val="12"/>
+          <w:szCs w:val="12"/>
+        </w:rPr>
+        <w:t xml:space="preserve"> = 1;</w:t>
+      </w:r>
+    </w:p>
+    <w:p>
+      <w:pPr>
+        <w:pStyle w:val="ListParagraph"/>
+        <w:rPr>
+          <w:rFonts w:ascii="Courier New" w:hAnsi="Courier New" w:cs="Courier New"/>
+          <w:sz w:val="12"/>
+          <w:szCs w:val="12"/>
+        </w:rPr>
+      </w:pPr>
+    </w:p>
+    <w:p>
+      <w:pPr>
+        <w:pStyle w:val="ListParagraph"/>
+        <w:rPr>
+          <w:rFonts w:ascii="Courier New" w:hAnsi="Courier New" w:cs="Courier New"/>
+          <w:sz w:val="12"/>
+          <w:szCs w:val="12"/>
+        </w:rPr>
+      </w:pPr>
+      <w:r>
+        <w:rPr>
+          <w:rFonts w:ascii="Courier New" w:hAnsi="Courier New" w:cs="Courier New"/>
+          <w:sz w:val="12"/>
+          <w:szCs w:val="12"/>
+        </w:rPr>
+        <w:t xml:space="preserve">UPDATE </w:t>
+      </w:r>
+      <w:proofErr w:type="spellStart"/>
+      <w:r>
+        <w:rPr>
+          <w:rFonts w:ascii="Courier New" w:hAnsi="Courier New" w:cs="Courier New"/>
+          <w:sz w:val="12"/>
+          <w:szCs w:val="12"/>
+        </w:rPr>
+        <w:t>care_centers</w:t>
+      </w:r>
+      <w:proofErr w:type="spellEnd"/>
+      <w:r>
+        <w:rPr>
+          <w:rFonts w:ascii="Courier New" w:hAnsi="Courier New" w:cs="Courier New"/>
+          <w:sz w:val="12"/>
+          <w:szCs w:val="12"/>
+        </w:rPr>
+        <w:t xml:space="preserve"> SET </w:t>
+      </w:r>
+      <w:proofErr w:type="spellStart"/>
+      <w:r>
+        <w:rPr>
+          <w:rFonts w:ascii="Courier New" w:hAnsi="Courier New" w:cs="Courier New"/>
+          <w:sz w:val="12"/>
+          <w:szCs w:val="12"/>
+        </w:rPr>
+        <w:t>nurse_charge_id</w:t>
+      </w:r>
+      <w:proofErr w:type="spellEnd"/>
+      <w:r>
+        <w:rPr>
+          <w:rFonts w:ascii="Courier New" w:hAnsi="Courier New" w:cs="Courier New"/>
+          <w:sz w:val="12"/>
+          <w:szCs w:val="12"/>
+        </w:rPr>
+        <w:t xml:space="preserve"> = 2 WHERE </w:t>
+      </w:r>
+      <w:proofErr w:type="spellStart"/>
+      <w:r>
+        <w:rPr>
+          <w:rFonts w:ascii="Courier New" w:hAnsi="Courier New" w:cs="Courier New"/>
+          <w:sz w:val="12"/>
+          <w:szCs w:val="12"/>
+        </w:rPr>
+        <w:t>cid</w:t>
+      </w:r>
+      <w:proofErr w:type="spellEnd"/>
+      <w:r>
+        <w:rPr>
+          <w:rFonts w:ascii="Courier New" w:hAnsi="Courier New" w:cs="Courier New"/>
+          <w:sz w:val="12"/>
+          <w:szCs w:val="12"/>
+        </w:rPr>
+        <w:t xml:space="preserve"> = 2;</w:t>
+      </w:r>
+    </w:p>
+    <w:p>
+      <w:pPr>
+        <w:pStyle w:val="ListParagraph"/>
+        <w:rPr>
+          <w:rFonts w:ascii="Courier New" w:hAnsi="Courier New" w:cs="Courier New"/>
+          <w:sz w:val="12"/>
+          <w:szCs w:val="12"/>
+        </w:rPr>
+      </w:pPr>
+    </w:p>
+    <w:p>
+      <w:pPr>
+        <w:pStyle w:val="ListParagraph"/>
+        <w:rPr>
+          <w:rFonts w:ascii="Courier New" w:hAnsi="Courier New" w:cs="Courier New"/>
+          <w:sz w:val="12"/>
+          <w:szCs w:val="12"/>
+        </w:rPr>
+      </w:pPr>
+      <w:r>
+        <w:rPr>
+          <w:rFonts w:ascii="Courier New" w:hAnsi="Courier New" w:cs="Courier New"/>
+          <w:sz w:val="12"/>
+          <w:szCs w:val="12"/>
+        </w:rPr>
+        <w:t xml:space="preserve">UPDATE </w:t>
+      </w:r>
+      <w:proofErr w:type="spellStart"/>
+      <w:r>
+        <w:rPr>
+          <w:rFonts w:ascii="Courier New" w:hAnsi="Courier New" w:cs="Courier New"/>
+          <w:sz w:val="12"/>
+          <w:szCs w:val="12"/>
+        </w:rPr>
+        <w:t>care_centers</w:t>
+      </w:r>
+      <w:proofErr w:type="spellEnd"/>
+      <w:r>
+        <w:rPr>
+          <w:rFonts w:ascii="Courier New" w:hAnsi="Courier New" w:cs="Courier New"/>
+          <w:sz w:val="12"/>
+          <w:szCs w:val="12"/>
+        </w:rPr>
+        <w:t xml:space="preserve"> SET </w:t>
+      </w:r>
+      <w:proofErr w:type="spellStart"/>
+      <w:r>
+        <w:rPr>
+          <w:rFonts w:ascii="Courier New" w:hAnsi="Courier New" w:cs="Courier New"/>
+          <w:sz w:val="12"/>
+          <w:szCs w:val="12"/>
+        </w:rPr>
+        <w:t>nurse_charge_id</w:t>
+      </w:r>
+      <w:proofErr w:type="spellEnd"/>
+      <w:r>
+        <w:rPr>
+          <w:rFonts w:ascii="Courier New" w:hAnsi="Courier New" w:cs="Courier New"/>
+          <w:sz w:val="12"/>
+          <w:szCs w:val="12"/>
+        </w:rPr>
+        <w:t xml:space="preserve"> = 3 WHERE </w:t>
+      </w:r>
+      <w:proofErr w:type="spellStart"/>
+      <w:r>
+        <w:rPr>
+          <w:rFonts w:ascii="Courier New" w:hAnsi="Courier New" w:cs="Courier New"/>
+          <w:sz w:val="12"/>
+          <w:szCs w:val="12"/>
+        </w:rPr>
+        <w:t>cid</w:t>
+      </w:r>
+      <w:proofErr w:type="spellEnd"/>
+      <w:r>
+        <w:rPr>
+          <w:rFonts w:ascii="Courier New" w:hAnsi="Courier New" w:cs="Courier New"/>
+          <w:sz w:val="12"/>
+          <w:szCs w:val="12"/>
+        </w:rPr>
+        <w:t xml:space="preserve"> = 3;</w:t>
+      </w:r>
+    </w:p>
+    <w:p>
+      <w:pPr>
+        <w:pStyle w:val="ListParagraph"/>
+        <w:rPr>
+          <w:rFonts w:ascii="Courier New" w:hAnsi="Courier New" w:cs="Courier New"/>
+          <w:sz w:val="12"/>
+          <w:szCs w:val="12"/>
+        </w:rPr>
+      </w:pPr>
+    </w:p>
+    <w:p>
+      <w:pPr>
+        <w:pStyle w:val="ListParagraph"/>
+        <w:rPr>
+          <w:rFonts w:ascii="Courier New" w:hAnsi="Courier New" w:cs="Courier New"/>
+          <w:sz w:val="12"/>
+          <w:szCs w:val="12"/>
+        </w:rPr>
+      </w:pPr>
+      <w:r>
+        <w:rPr>
+          <w:rFonts w:ascii="Courier New" w:hAnsi="Courier New" w:cs="Courier New"/>
+          <w:sz w:val="12"/>
+          <w:szCs w:val="12"/>
+        </w:rPr>
+        <w:t>--- Patients:</w:t>
+      </w:r>
+    </w:p>
+    <w:p>
+      <w:pPr>
+        <w:pStyle w:val="ListParagraph"/>
+        <w:rPr>
+          <w:rFonts w:ascii="Courier New" w:hAnsi="Courier New" w:cs="Courier New"/>
+          <w:sz w:val="12"/>
+          <w:szCs w:val="12"/>
+        </w:rPr>
+      </w:pPr>
+      <w:r>
+        <w:rPr>
+          <w:rFonts w:ascii="Courier New" w:hAnsi="Courier New" w:cs="Courier New"/>
+          <w:sz w:val="12"/>
+          <w:szCs w:val="12"/>
+        </w:rPr>
+        <w:t xml:space="preserve">INSERT INTO patients (name, address, telephone, </w:t>
+      </w:r>
+      <w:proofErr w:type="spellStart"/>
+      <w:r>
+        <w:rPr>
+          <w:rFonts w:ascii="Courier New" w:hAnsi="Courier New" w:cs="Courier New"/>
+          <w:sz w:val="12"/>
+          <w:szCs w:val="12"/>
+        </w:rPr>
+        <w:t>care_center_id</w:t>
+      </w:r>
+      <w:proofErr w:type="spellEnd"/>
+      <w:r>
+        <w:rPr>
+          <w:rFonts w:ascii="Courier New" w:hAnsi="Courier New" w:cs="Courier New"/>
+          <w:sz w:val="12"/>
+          <w:szCs w:val="12"/>
+        </w:rPr>
+        <w:t>)</w:t>
+      </w:r>
+    </w:p>
+    <w:p>
+      <w:pPr>
+        <w:pStyle w:val="ListParagraph"/>
+        <w:rPr>
+          <w:rFonts w:ascii="Courier New" w:hAnsi="Courier New" w:cs="Courier New"/>
+          <w:sz w:val="12"/>
+          <w:szCs w:val="12"/>
+        </w:rPr>
+      </w:pPr>
+      <w:r>
+        <w:rPr>
+          <w:rFonts w:ascii="Courier New" w:hAnsi="Courier New" w:cs="Courier New"/>
+          <w:sz w:val="12"/>
+          <w:szCs w:val="12"/>
+        </w:rPr>
+        <w:t>VALUES ('John Matthews', '12 Oak Street, Kanata', '613-555-4010', 1);</w:t>
+      </w:r>
+    </w:p>
+    <w:p>
+      <w:pPr>
+        <w:pStyle w:val="ListParagraph"/>
+        <w:rPr>
+          <w:rFonts w:ascii="Courier New" w:hAnsi="Courier New" w:cs="Courier New"/>
+          <w:sz w:val="12"/>
+          <w:szCs w:val="12"/>
+        </w:rPr>
+      </w:pPr>
+    </w:p>
+    <w:p>
+      <w:pPr>
+        <w:pStyle w:val="ListParagraph"/>
+        <w:rPr>
+          <w:rFonts w:ascii="Courier New" w:hAnsi="Courier New" w:cs="Courier New"/>
+          <w:sz w:val="12"/>
+          <w:szCs w:val="12"/>
+        </w:rPr>
+      </w:pPr>
+      <w:r>
+        <w:rPr>
+          <w:rFonts w:ascii="Courier New" w:hAnsi="Courier New" w:cs="Courier New"/>
+          <w:sz w:val="12"/>
+          <w:szCs w:val="12"/>
+        </w:rPr>
+        <w:t xml:space="preserve">INSERT INTO patients (name, address, telephone, </w:t>
+      </w:r>
+      <w:proofErr w:type="spellStart"/>
+      <w:r>
+        <w:rPr>
+          <w:rFonts w:ascii="Courier New" w:hAnsi="Courier New" w:cs="Courier New"/>
+          <w:sz w:val="12"/>
+          <w:szCs w:val="12"/>
+        </w:rPr>
+        <w:t>care_center_id</w:t>
+      </w:r>
+      <w:proofErr w:type="spellEnd"/>
+      <w:r>
+        <w:rPr>
+          <w:rFonts w:ascii="Courier New" w:hAnsi="Courier New" w:cs="Courier New"/>
+          <w:sz w:val="12"/>
+          <w:szCs w:val="12"/>
+        </w:rPr>
+        <w:t>)</w:t>
+      </w:r>
+    </w:p>
+    <w:p>
+      <w:pPr>
+        <w:pStyle w:val="ListParagraph"/>
+        <w:rPr>
+          <w:rFonts w:ascii="Courier New" w:hAnsi="Courier New" w:cs="Courier New"/>
+          <w:sz w:val="12"/>
+          <w:szCs w:val="12"/>
+        </w:rPr>
+      </w:pPr>
+      <w:r>
+        <w:rPr>
+          <w:rFonts w:ascii="Courier New" w:hAnsi="Courier New" w:cs="Courier New"/>
+          <w:sz w:val="12"/>
+          <w:szCs w:val="12"/>
+        </w:rPr>
+        <w:t>VALUES ('Linda Park', '88 Pine Avenue, Nepean', '613-555-4020', 2);</w:t>
+      </w:r>
+    </w:p>
+    <w:p>
+      <w:pPr>
+        <w:pStyle w:val="ListParagraph"/>
+        <w:rPr>
+          <w:rFonts w:ascii="Courier New" w:hAnsi="Courier New" w:cs="Courier New"/>
+          <w:sz w:val="12"/>
+          <w:szCs w:val="12"/>
+        </w:rPr>
+      </w:pPr>
+    </w:p>
+    <w:p>
+      <w:pPr>
+        <w:pStyle w:val="ListParagraph"/>
+        <w:rPr>
+          <w:rFonts w:ascii="Courier New" w:hAnsi="Courier New" w:cs="Courier New"/>
+          <w:sz w:val="12"/>
+          <w:szCs w:val="12"/>
+        </w:rPr>
+      </w:pPr>
+      <w:r>
+        <w:rPr>
+          <w:rFonts w:ascii="Courier New" w:hAnsi="Courier New" w:cs="Courier New"/>
+          <w:sz w:val="12"/>
+          <w:szCs w:val="12"/>
+        </w:rPr>
+        <w:t xml:space="preserve">INSERT INTO patients (name, address, telephone, </w:t>
+      </w:r>
+      <w:proofErr w:type="spellStart"/>
+      <w:r>
+        <w:rPr>
+          <w:rFonts w:ascii="Courier New" w:hAnsi="Courier New" w:cs="Courier New"/>
+          <w:sz w:val="12"/>
+          <w:szCs w:val="12"/>
+        </w:rPr>
+        <w:t>care_center_id</w:t>
+      </w:r>
+      <w:proofErr w:type="spellEnd"/>
+      <w:r>
+        <w:rPr>
+          <w:rFonts w:ascii="Courier New" w:hAnsi="Courier New" w:cs="Courier New"/>
+          <w:sz w:val="12"/>
+          <w:szCs w:val="12"/>
+        </w:rPr>
+        <w:t>)</w:t>
+      </w:r>
+    </w:p>
+    <w:p>
+      <w:pPr>
+        <w:pStyle w:val="ListParagraph"/>
+        <w:rPr>
+          <w:rFonts w:ascii="Courier New" w:hAnsi="Courier New" w:cs="Courier New"/>
+          <w:sz w:val="12"/>
+          <w:szCs w:val="12"/>
+        </w:rPr>
+      </w:pPr>
+      <w:r>
+        <w:rPr>
+          <w:rFonts w:ascii="Courier New" w:hAnsi="Courier New" w:cs="Courier New"/>
+          <w:sz w:val="12"/>
+          <w:szCs w:val="12"/>
+        </w:rPr>
+        <w:t>VALUES ('Carlos Rivera', '55 Elm Crescent, Orleans', '613-555-4030', 3);</w:t>
+      </w:r>
+    </w:p>
+    <w:p>
+      <w:pPr>
+        <w:pStyle w:val="ListParagraph"/>
+        <w:rPr>
+          <w:rFonts w:ascii="Courier New" w:hAnsi="Courier New" w:cs="Courier New"/>
+          <w:sz w:val="12"/>
+          <w:szCs w:val="12"/>
+        </w:rPr>
+      </w:pPr>
+    </w:p>
+    <w:p>
+      <w:pPr>
+        <w:pStyle w:val="ListParagraph"/>
+        <w:rPr>
+          <w:rFonts w:ascii="Courier New" w:hAnsi="Courier New" w:cs="Courier New"/>
+          <w:sz w:val="12"/>
+          <w:szCs w:val="12"/>
+        </w:rPr>
+      </w:pPr>
+      <w:r>
+        <w:rPr>
+          <w:rFonts w:ascii="Courier New" w:hAnsi="Courier New" w:cs="Courier New"/>
+          <w:sz w:val="12"/>
+          <w:szCs w:val="12"/>
+        </w:rPr>
+        <w:t>--- Treatments:</w:t>
+      </w:r>
+    </w:p>
+    <w:p>
+      <w:pPr>
+        <w:pStyle w:val="ListParagraph"/>
+        <w:rPr>
+          <w:rFonts w:ascii="Courier New" w:hAnsi="Courier New" w:cs="Courier New"/>
+          <w:sz w:val="12"/>
+          <w:szCs w:val="12"/>
+        </w:rPr>
+      </w:pPr>
+      <w:r>
+        <w:rPr>
+          <w:rFonts w:ascii="Courier New" w:hAnsi="Courier New" w:cs="Courier New"/>
+          <w:sz w:val="12"/>
+          <w:szCs w:val="12"/>
+        </w:rPr>
+        <w:t>INSERT INTO treatments (</w:t>
+      </w:r>
+      <w:proofErr w:type="spellStart"/>
+      <w:r>
+        <w:rPr>
+          <w:rFonts w:ascii="Courier New" w:hAnsi="Courier New" w:cs="Courier New"/>
+          <w:sz w:val="12"/>
+          <w:szCs w:val="12"/>
+        </w:rPr>
+        <w:t>patient_id</w:t>
+      </w:r>
+      <w:proofErr w:type="spellEnd"/>
+      <w:r>
+        <w:rPr>
+          <w:rFonts w:ascii="Courier New" w:hAnsi="Courier New" w:cs="Courier New"/>
+          <w:sz w:val="12"/>
+          <w:szCs w:val="12"/>
+        </w:rPr>
+        <w:t xml:space="preserve">, </w:t>
+      </w:r>
+      <w:proofErr w:type="spellStart"/>
+      <w:r>
+        <w:rPr>
+          <w:rFonts w:ascii="Courier New" w:hAnsi="Courier New" w:cs="Courier New"/>
+          <w:sz w:val="12"/>
+          <w:szCs w:val="12"/>
+        </w:rPr>
+        <w:t>physician_id</w:t>
+      </w:r>
+      <w:proofErr w:type="spellEnd"/>
+      <w:r>
+        <w:rPr>
+          <w:rFonts w:ascii="Courier New" w:hAnsi="Courier New" w:cs="Courier New"/>
+          <w:sz w:val="12"/>
+          <w:szCs w:val="12"/>
+        </w:rPr>
+        <w:t xml:space="preserve">, </w:t>
+      </w:r>
+      <w:proofErr w:type="spellStart"/>
+      <w:r>
+        <w:rPr>
+          <w:rFonts w:ascii="Courier New" w:hAnsi="Courier New" w:cs="Courier New"/>
+          <w:sz w:val="12"/>
+          <w:szCs w:val="12"/>
+        </w:rPr>
+        <w:t>treatment_name</w:t>
+      </w:r>
+      <w:proofErr w:type="spellEnd"/>
+      <w:r>
+        <w:rPr>
+          <w:rFonts w:ascii="Courier New" w:hAnsi="Courier New" w:cs="Courier New"/>
+          <w:sz w:val="12"/>
+          <w:szCs w:val="12"/>
+        </w:rPr>
+        <w:t>, date)</w:t>
+      </w:r>
+    </w:p>
+    <w:p>
+      <w:pPr>
+        <w:pStyle w:val="ListParagraph"/>
+        <w:rPr>
+          <w:rFonts w:ascii="Courier New" w:hAnsi="Courier New" w:cs="Courier New"/>
+          <w:sz w:val="12"/>
+          <w:szCs w:val="12"/>
+        </w:rPr>
+      </w:pPr>
+      <w:r>
+        <w:rPr>
+          <w:rFonts w:ascii="Courier New" w:hAnsi="Courier New" w:cs="Courier New"/>
+          <w:sz w:val="12"/>
+          <w:szCs w:val="12"/>
+        </w:rPr>
+        <w:t>VALUES (1, 1, 'Cardiac Stress Test', DATE '2026-09-15');</w:t>
+      </w:r>
+    </w:p>
+    <w:p>
+      <w:pPr>
+        <w:pStyle w:val="ListParagraph"/>
+        <w:rPr>
+          <w:rFonts w:ascii="Courier New" w:hAnsi="Courier New" w:cs="Courier New"/>
+          <w:sz w:val="12"/>
+          <w:szCs w:val="12"/>
+        </w:rPr>
+      </w:pPr>
+    </w:p>
+    <w:p>
+      <w:pPr>
+        <w:pStyle w:val="ListParagraph"/>
+        <w:rPr>
+          <w:rFonts w:ascii="Courier New" w:hAnsi="Courier New" w:cs="Courier New"/>
+          <w:sz w:val="12"/>
+          <w:szCs w:val="12"/>
+        </w:rPr>
+      </w:pPr>
+      <w:r>
+        <w:rPr>
+          <w:rFonts w:ascii="Courier New" w:hAnsi="Courier New" w:cs="Courier New"/>
+          <w:sz w:val="12"/>
+          <w:szCs w:val="12"/>
+        </w:rPr>
+        <w:t>INSERT INTO treatments (</w:t>
+      </w:r>
+      <w:proofErr w:type="spellStart"/>
+      <w:r>
+        <w:rPr>
+          <w:rFonts w:ascii="Courier New" w:hAnsi="Courier New" w:cs="Courier New"/>
+          <w:sz w:val="12"/>
+          <w:szCs w:val="12"/>
+        </w:rPr>
+        <w:t>patient_id</w:t>
+      </w:r>
+      <w:proofErr w:type="spellEnd"/>
+      <w:r>
+        <w:rPr>
+          <w:rFonts w:ascii="Courier New" w:hAnsi="Courier New" w:cs="Courier New"/>
+          <w:sz w:val="12"/>
+          <w:szCs w:val="12"/>
+        </w:rPr>
+        <w:t xml:space="preserve">, </w:t>
+      </w:r>
+      <w:proofErr w:type="spellStart"/>
+      <w:r>
+        <w:rPr>
+          <w:rFonts w:ascii="Courier New" w:hAnsi="Courier New" w:cs="Courier New"/>
+          <w:sz w:val="12"/>
+          <w:szCs w:val="12"/>
+        </w:rPr>
+        <w:t>physician_id</w:t>
+      </w:r>
+      <w:proofErr w:type="spellEnd"/>
+      <w:r>
+        <w:rPr>
+          <w:rFonts w:ascii="Courier New" w:hAnsi="Courier New" w:cs="Courier New"/>
+          <w:sz w:val="12"/>
+          <w:szCs w:val="12"/>
+        </w:rPr>
+        <w:t xml:space="preserve">, </w:t>
+      </w:r>
+      <w:proofErr w:type="spellStart"/>
+      <w:r>
+        <w:rPr>
+          <w:rFonts w:ascii="Courier New" w:hAnsi="Courier New" w:cs="Courier New"/>
+          <w:sz w:val="12"/>
+          <w:szCs w:val="12"/>
+        </w:rPr>
+        <w:t>treatment_name</w:t>
+      </w:r>
+      <w:proofErr w:type="spellEnd"/>
+      <w:r>
+        <w:rPr>
+          <w:rFonts w:ascii="Courier New" w:hAnsi="Courier New" w:cs="Courier New"/>
+          <w:sz w:val="12"/>
+          <w:szCs w:val="12"/>
+        </w:rPr>
+        <w:t>, date)</w:t>
+      </w:r>
+    </w:p>
+    <w:p>
+      <w:pPr>
+        <w:pStyle w:val="ListParagraph"/>
+        <w:rPr>
+          <w:rFonts w:ascii="Courier New" w:hAnsi="Courier New" w:cs="Courier New"/>
+          <w:sz w:val="12"/>
+          <w:szCs w:val="12"/>
+        </w:rPr>
+      </w:pPr>
+      <w:r>
+        <w:rPr>
+          <w:rFonts w:ascii="Courier New" w:hAnsi="Courier New" w:cs="Courier New"/>
+          <w:sz w:val="12"/>
+          <w:szCs w:val="12"/>
+        </w:rPr>
+        <w:t>VALUES (2, 2, 'Neurological Assessment', DATE '2026-09-18');</w:t>
+      </w:r>
+    </w:p>
+    <w:p>
+      <w:pPr>
+        <w:pStyle w:val="ListParagraph"/>
+        <w:rPr>
+          <w:rFonts w:ascii="Courier New" w:hAnsi="Courier New" w:cs="Courier New"/>
+          <w:sz w:val="12"/>
+          <w:szCs w:val="12"/>
+        </w:rPr>
+      </w:pPr>
+    </w:p>
+    <w:p>
+      <w:pPr>
+        <w:pStyle w:val="ListParagraph"/>
+        <w:rPr>
+          <w:rFonts w:ascii="Courier New" w:hAnsi="Courier New" w:cs="Courier New"/>
+          <w:sz w:val="12"/>
+          <w:szCs w:val="12"/>
+        </w:rPr>
+      </w:pPr>
+      <w:r>
+        <w:rPr>
+          <w:rFonts w:ascii="Courier New" w:hAnsi="Courier New" w:cs="Courier New"/>
+          <w:sz w:val="12"/>
+          <w:szCs w:val="12"/>
+        </w:rPr>
+        <w:t>INSERT INTO treatments (</w:t>
+      </w:r>
+      <w:proofErr w:type="spellStart"/>
+      <w:r>
+        <w:rPr>
+          <w:rFonts w:ascii="Courier New" w:hAnsi="Courier New" w:cs="Courier New"/>
+          <w:sz w:val="12"/>
+          <w:szCs w:val="12"/>
+        </w:rPr>
+        <w:t>patient_id</w:t>
+      </w:r>
+      <w:proofErr w:type="spellEnd"/>
+      <w:r>
+        <w:rPr>
+          <w:rFonts w:ascii="Courier New" w:hAnsi="Courier New" w:cs="Courier New"/>
+          <w:sz w:val="12"/>
+          <w:szCs w:val="12"/>
+        </w:rPr>
+        <w:t xml:space="preserve">, </w:t>
+      </w:r>
+      <w:proofErr w:type="spellStart"/>
+      <w:r>
+        <w:rPr>
+          <w:rFonts w:ascii="Courier New" w:hAnsi="Courier New" w:cs="Courier New"/>
+          <w:sz w:val="12"/>
+          <w:szCs w:val="12"/>
+        </w:rPr>
+        <w:t>physician_id</w:t>
+      </w:r>
+      <w:proofErr w:type="spellEnd"/>
+      <w:r>
+        <w:rPr>
+          <w:rFonts w:ascii="Courier New" w:hAnsi="Courier New" w:cs="Courier New"/>
+          <w:sz w:val="12"/>
+          <w:szCs w:val="12"/>
+        </w:rPr>
+        <w:t xml:space="preserve">, </w:t>
+      </w:r>
+      <w:proofErr w:type="spellStart"/>
+      <w:r>
+        <w:rPr>
+          <w:rFonts w:ascii="Courier New" w:hAnsi="Courier New" w:cs="Courier New"/>
+          <w:sz w:val="12"/>
+          <w:szCs w:val="12"/>
+        </w:rPr>
+        <w:t>treatment_name</w:t>
+      </w:r>
+      <w:proofErr w:type="spellEnd"/>
+      <w:r>
+        <w:rPr>
+          <w:rFonts w:ascii="Courier New" w:hAnsi="Courier New" w:cs="Courier New"/>
+          <w:sz w:val="12"/>
+          <w:szCs w:val="12"/>
+        </w:rPr>
+        <w:t>, date)</w:t>
+      </w:r>
+    </w:p>
+    <w:p>
+      <w:pPr>
+        <w:pStyle w:val="ListParagraph"/>
+        <w:rPr>
+          <w:rFonts w:ascii="Courier New" w:hAnsi="Courier New" w:cs="Courier New"/>
+          <w:sz w:val="12"/>
+          <w:szCs w:val="12"/>
+        </w:rPr>
+      </w:pPr>
+      <w:r>
+        <w:rPr>
+          <w:rFonts w:ascii="Courier New" w:hAnsi="Courier New" w:cs="Courier New"/>
+          <w:sz w:val="12"/>
+          <w:szCs w:val="12"/>
+        </w:rPr>
+        <w:t>VALUES (3, 3, 'Knee Joint Evaluation', DATE '2026-09-20');</w:t>
+      </w:r>
+    </w:p>
+    <w:p>
+      <w:pPr>
+        <w:pStyle w:val="ListParagraph"/>
+        <w:rPr>
+          <w:rFonts w:ascii="Courier New" w:hAnsi="Courier New" w:cs="Courier New"/>
+          <w:sz w:val="12"/>
+          <w:szCs w:val="12"/>
+        </w:rPr>
+      </w:pPr>
+    </w:p>
+    <w:p>
+      <w:pPr>
+        <w:pStyle w:val="ListParagraph"/>
+        <w:rPr>
+          <w:rFonts w:ascii="Courier New" w:hAnsi="Courier New" w:cs="Courier New"/>
+          <w:sz w:val="12"/>
+          <w:szCs w:val="12"/>
+        </w:rPr>
+      </w:pPr>
+      <w:r>
+        <w:rPr>
+          <w:rFonts w:ascii="Courier New" w:hAnsi="Courier New" w:cs="Courier New"/>
+          <w:sz w:val="12"/>
+          <w:szCs w:val="12"/>
+        </w:rPr>
+        <w:t>INSERT INTO treatments (</w:t>
+      </w:r>
+      <w:proofErr w:type="spellStart"/>
+      <w:r>
+        <w:rPr>
+          <w:rFonts w:ascii="Courier New" w:hAnsi="Courier New" w:cs="Courier New"/>
+          <w:sz w:val="12"/>
+          <w:szCs w:val="12"/>
+        </w:rPr>
+        <w:t>patient_id</w:t>
+      </w:r>
+      <w:proofErr w:type="spellEnd"/>
+      <w:r>
+        <w:rPr>
+          <w:rFonts w:ascii="Courier New" w:hAnsi="Courier New" w:cs="Courier New"/>
+          <w:sz w:val="12"/>
+          <w:szCs w:val="12"/>
+        </w:rPr>
+        <w:t xml:space="preserve">, </w:t>
+      </w:r>
+      <w:proofErr w:type="spellStart"/>
+      <w:r>
+        <w:rPr>
+          <w:rFonts w:ascii="Courier New" w:hAnsi="Courier New" w:cs="Courier New"/>
+          <w:sz w:val="12"/>
+          <w:szCs w:val="12"/>
+        </w:rPr>
+        <w:t>physician_id</w:t>
+      </w:r>
+      <w:proofErr w:type="spellEnd"/>
+      <w:r>
+        <w:rPr>
+          <w:rFonts w:ascii="Courier New" w:hAnsi="Courier New" w:cs="Courier New"/>
+          <w:sz w:val="12"/>
+          <w:szCs w:val="12"/>
+        </w:rPr>
+        <w:t xml:space="preserve">, </w:t>
+      </w:r>
+      <w:proofErr w:type="spellStart"/>
+      <w:r>
+        <w:rPr>
+          <w:rFonts w:ascii="Courier New" w:hAnsi="Courier New" w:cs="Courier New"/>
+          <w:sz w:val="12"/>
+          <w:szCs w:val="12"/>
+        </w:rPr>
+        <w:t>treatment_name</w:t>
+      </w:r>
+      <w:proofErr w:type="spellEnd"/>
+      <w:r>
+        <w:rPr>
+          <w:rFonts w:ascii="Courier New" w:hAnsi="Courier New" w:cs="Courier New"/>
+          <w:sz w:val="12"/>
+          <w:szCs w:val="12"/>
+        </w:rPr>
+        <w:t>, date)</w:t>
+      </w:r>
+    </w:p>
+    <w:p>
+      <w:pPr>
+        <w:pStyle w:val="ListParagraph"/>
+        <w:rPr>
+          <w:rFonts w:ascii="Courier New" w:hAnsi="Courier New" w:cs="Courier New"/>
+          <w:sz w:val="12"/>
+          <w:szCs w:val="12"/>
+        </w:rPr>
+      </w:pPr>
+      <w:r>
+        <w:rPr>
+          <w:rFonts w:ascii="Courier New" w:hAnsi="Courier New" w:cs="Courier New"/>
+          <w:sz w:val="12"/>
+          <w:szCs w:val="12"/>
+        </w:rPr>
+        <w:t>VALUES (1, 3, 'Orthopedic Follow-up', DATE '2026-10-01');</w:t>
+      </w:r>
+    </w:p>
+    <w:p>
+      <w:pPr>
+        <w:pStyle w:val="ListParagraph"/>
+        <w:rPr>
+          <w:rFonts w:ascii="Courier New" w:hAnsi="Courier New" w:cs="Courier New"/>
+          <w:sz w:val="12"/>
+          <w:szCs w:val="12"/>
+        </w:rPr>
+      </w:pPr>
+    </w:p>
+    <w:p>
+      <w:pPr>
+        <w:pStyle w:val="ListParagraph"/>
+        <w:rPr>
+          <w:rFonts w:ascii="Courier New" w:hAnsi="Courier New" w:cs="Courier New"/>
+          <w:sz w:val="12"/>
+          <w:szCs w:val="12"/>
+        </w:rPr>
+      </w:pPr>
+    </w:p>
+    <w:p>
+      <w:pPr>
+        <w:pStyle w:val="ListParagraph"/>
+        <w:rPr>
+          <w:rFonts w:ascii="Courier New" w:hAnsi="Courier New" w:cs="Courier New"/>
+          <w:sz w:val="12"/>
+          <w:szCs w:val="12"/>
+        </w:rPr>
+      </w:pPr>
+    </w:p>
+    <w:p>
+      <w:pPr>
+        <w:pStyle w:val="ListParagraph"/>
+        <w:rPr>
+          <w:rFonts w:ascii="Courier New" w:hAnsi="Courier New" w:cs="Courier New"/>
+          <w:sz w:val="12"/>
+          <w:szCs w:val="12"/>
+        </w:rPr>
+      </w:pPr>
+    </w:p>
+    <w:p>
+      <w:pPr>
+        <w:pStyle w:val="ListParagraph"/>
+        <w:rPr>
+          <w:rFonts w:ascii="Courier New" w:hAnsi="Courier New" w:cs="Courier New"/>
+          <w:sz w:val="12"/>
+          <w:szCs w:val="12"/>
+        </w:rPr>
+      </w:pPr>
+      <w:r>
+        <w:rPr>
+          <w:rFonts w:ascii="Courier New" w:hAnsi="Courier New" w:cs="Courier New"/>
+          <w:sz w:val="12"/>
+          <w:szCs w:val="12"/>
+        </w:rPr>
+        <w:t>--- *************************************************************************************************</w:t>
+      </w:r>
+    </w:p>
+    <w:p>
+      <w:pPr>
+        <w:pStyle w:val="ListParagraph"/>
+        <w:rPr>
+          <w:rFonts w:ascii="Courier New" w:hAnsi="Courier New" w:cs="Courier New"/>
+          <w:sz w:val="12"/>
+          <w:szCs w:val="12"/>
+        </w:rPr>
+      </w:pPr>
+      <w:r>
+        <w:rPr>
+          <w:rFonts w:ascii="Courier New" w:hAnsi="Courier New" w:cs="Courier New"/>
+          <w:sz w:val="12"/>
+          <w:szCs w:val="12"/>
+        </w:rPr>
+        <w:t>--- ***         SELECT STATEMENTS                                                                 ***</w:t>
+      </w:r>
+    </w:p>
+    <w:p>
+      <w:pPr>
+        <w:pStyle w:val="ListParagraph"/>
+        <w:rPr>
+          <w:rFonts w:ascii="Courier New" w:hAnsi="Courier New" w:cs="Courier New"/>
+          <w:sz w:val="12"/>
+          <w:szCs w:val="12"/>
+        </w:rPr>
+      </w:pPr>
+      <w:r>
+        <w:rPr>
+          <w:rFonts w:ascii="Courier New" w:hAnsi="Courier New" w:cs="Courier New"/>
+          <w:sz w:val="12"/>
+          <w:szCs w:val="12"/>
+        </w:rPr>
+        <w:t>--- *************************************************************************************************</w:t>
+      </w:r>
+    </w:p>
+    <w:p>
+      <w:pPr>
+        <w:pStyle w:val="ListParagraph"/>
+        <w:rPr>
+          <w:rFonts w:ascii="Courier New" w:hAnsi="Courier New" w:cs="Courier New"/>
+          <w:sz w:val="12"/>
+          <w:szCs w:val="12"/>
+        </w:rPr>
+      </w:pPr>
+    </w:p>
+    <w:p>
+      <w:pPr>
+        <w:pStyle w:val="ListParagraph"/>
+        <w:rPr>
+          <w:rFonts w:ascii="Courier New" w:hAnsi="Courier New" w:cs="Courier New"/>
+          <w:sz w:val="12"/>
+          <w:szCs w:val="12"/>
+        </w:rPr>
+      </w:pPr>
+      <w:r>
+        <w:rPr>
+          <w:rFonts w:ascii="Courier New" w:hAnsi="Courier New" w:cs="Courier New"/>
+          <w:sz w:val="12"/>
+          <w:szCs w:val="12"/>
+        </w:rPr>
+        <w:t>--- * generic select from each table</w:t>
+      </w:r>
+    </w:p>
+    <w:p>
+      <w:pPr>
+        <w:pStyle w:val="ListParagraph"/>
+        <w:rPr>
+          <w:rFonts w:ascii="Courier New" w:hAnsi="Courier New" w:cs="Courier New"/>
+          <w:sz w:val="12"/>
+          <w:szCs w:val="12"/>
+        </w:rPr>
+      </w:pPr>
+      <w:r>
+        <w:rPr>
+          <w:rFonts w:ascii="Courier New" w:hAnsi="Courier New" w:cs="Courier New"/>
+          <w:sz w:val="12"/>
+          <w:szCs w:val="12"/>
+        </w:rPr>
+        <w:t>select * from patients;</w:t>
+      </w:r>
+    </w:p>
+    <w:p>
+      <w:pPr>
+        <w:pStyle w:val="ListParagraph"/>
+        <w:rPr>
+          <w:rFonts w:ascii="Courier New" w:hAnsi="Courier New" w:cs="Courier New"/>
+          <w:sz w:val="12"/>
+          <w:szCs w:val="12"/>
+        </w:rPr>
+      </w:pPr>
+      <w:r>
+        <w:rPr>
+          <w:rFonts w:ascii="Courier New" w:hAnsi="Courier New" w:cs="Courier New"/>
+          <w:sz w:val="12"/>
+          <w:szCs w:val="12"/>
+        </w:rPr>
+        <w:t>select * from treatments;</w:t>
+      </w:r>
+    </w:p>
+    <w:p>
+      <w:pPr>
+        <w:pStyle w:val="ListParagraph"/>
+        <w:rPr>
+          <w:rFonts w:ascii="Courier New" w:hAnsi="Courier New" w:cs="Courier New"/>
+          <w:sz w:val="12"/>
+          <w:szCs w:val="12"/>
+        </w:rPr>
+      </w:pPr>
+      <w:r>
+        <w:rPr>
+          <w:rFonts w:ascii="Courier New" w:hAnsi="Courier New" w:cs="Courier New"/>
+          <w:sz w:val="12"/>
+          <w:szCs w:val="12"/>
+        </w:rPr>
+        <w:t xml:space="preserve">select * from </w:t>
+      </w:r>
+      <w:proofErr w:type="spellStart"/>
+      <w:r>
+        <w:rPr>
+          <w:rFonts w:ascii="Courier New" w:hAnsi="Courier New" w:cs="Courier New"/>
+          <w:sz w:val="12"/>
+          <w:szCs w:val="12"/>
+        </w:rPr>
+        <w:t>care_centers</w:t>
+      </w:r>
+      <w:proofErr w:type="spellEnd"/>
+      <w:r>
+        <w:rPr>
+          <w:rFonts w:ascii="Courier New" w:hAnsi="Courier New" w:cs="Courier New"/>
+          <w:sz w:val="12"/>
+          <w:szCs w:val="12"/>
+        </w:rPr>
+        <w:t>;</w:t>
+      </w:r>
+    </w:p>
+    <w:p>
+      <w:pPr>
+        <w:pStyle w:val="ListParagraph"/>
+        <w:rPr>
+          <w:rFonts w:ascii="Courier New" w:hAnsi="Courier New" w:cs="Courier New"/>
+          <w:sz w:val="12"/>
+          <w:szCs w:val="12"/>
+        </w:rPr>
+      </w:pPr>
+      <w:r>
+        <w:rPr>
+          <w:rFonts w:ascii="Courier New" w:hAnsi="Courier New" w:cs="Courier New"/>
+          <w:sz w:val="12"/>
+          <w:szCs w:val="12"/>
+        </w:rPr>
+        <w:t>select * from nurses;</w:t>
+      </w:r>
+    </w:p>
+    <w:p>
+      <w:pPr>
+        <w:pStyle w:val="ListParagraph"/>
+        <w:rPr>
+          <w:rFonts w:ascii="Courier New" w:hAnsi="Courier New" w:cs="Courier New"/>
+          <w:sz w:val="12"/>
+          <w:szCs w:val="12"/>
+        </w:rPr>
+      </w:pPr>
+      <w:r>
+        <w:rPr>
+          <w:rFonts w:ascii="Courier New" w:hAnsi="Courier New" w:cs="Courier New"/>
+          <w:sz w:val="12"/>
+          <w:szCs w:val="12"/>
+        </w:rPr>
+        <w:t>select * from physicians;</w:t>
+      </w:r>
+    </w:p>
+    <w:p>
+      <w:pPr>
+        <w:pStyle w:val="ListParagraph"/>
+        <w:rPr>
+          <w:rFonts w:ascii="Courier New" w:hAnsi="Courier New" w:cs="Courier New"/>
+          <w:sz w:val="12"/>
+          <w:szCs w:val="12"/>
+        </w:rPr>
+      </w:pPr>
+    </w:p>
+    <w:p>
+      <w:pPr>
+        <w:pStyle w:val="ListParagraph"/>
+        <w:rPr>
+          <w:rFonts w:ascii="Courier New" w:hAnsi="Courier New" w:cs="Courier New"/>
+          <w:sz w:val="12"/>
+          <w:szCs w:val="12"/>
+        </w:rPr>
+      </w:pPr>
+      <w:r>
+        <w:rPr>
+          <w:rFonts w:ascii="Courier New" w:hAnsi="Courier New" w:cs="Courier New"/>
+          <w:sz w:val="12"/>
+          <w:szCs w:val="12"/>
+        </w:rPr>
+        <w:t xml:space="preserve">--- * all patients treatments for last year and </w:t>
+      </w:r>
+      <w:proofErr w:type="gramStart"/>
+      <w:r>
+        <w:rPr>
+          <w:rFonts w:ascii="Courier New" w:hAnsi="Courier New" w:cs="Courier New"/>
+          <w:sz w:val="12"/>
+          <w:szCs w:val="12"/>
+        </w:rPr>
+        <w:t>where</w:t>
+      </w:r>
+      <w:proofErr w:type="gramEnd"/>
+      <w:r>
+        <w:rPr>
+          <w:rFonts w:ascii="Courier New" w:hAnsi="Courier New" w:cs="Courier New"/>
+          <w:sz w:val="12"/>
+          <w:szCs w:val="12"/>
+        </w:rPr>
+        <w:t>, by whom</w:t>
+      </w:r>
+    </w:p>
+    <w:p>
+      <w:pPr>
+        <w:pStyle w:val="ListParagraph"/>
+        <w:rPr>
+          <w:rFonts w:ascii="Courier New" w:hAnsi="Courier New" w:cs="Courier New"/>
+          <w:sz w:val="12"/>
+          <w:szCs w:val="12"/>
+        </w:rPr>
+      </w:pPr>
+      <w:r>
+        <w:rPr>
+          <w:rFonts w:ascii="Courier New" w:hAnsi="Courier New" w:cs="Courier New"/>
+          <w:sz w:val="12"/>
+          <w:szCs w:val="12"/>
+        </w:rPr>
+        <w:t xml:space="preserve">select pat.name, </w:t>
+      </w:r>
+      <w:proofErr w:type="spellStart"/>
+      <w:proofErr w:type="gramStart"/>
+      <w:r>
+        <w:rPr>
+          <w:rFonts w:ascii="Courier New" w:hAnsi="Courier New" w:cs="Courier New"/>
+          <w:sz w:val="12"/>
+          <w:szCs w:val="12"/>
+        </w:rPr>
+        <w:t>t.treatment</w:t>
+      </w:r>
+      <w:proofErr w:type="gramEnd"/>
+      <w:r>
+        <w:rPr>
+          <w:rFonts w:ascii="Courier New" w:hAnsi="Courier New" w:cs="Courier New"/>
+          <w:sz w:val="12"/>
+          <w:szCs w:val="12"/>
+        </w:rPr>
+        <w:t>_name</w:t>
+      </w:r>
+      <w:proofErr w:type="spellEnd"/>
+      <w:r>
+        <w:rPr>
+          <w:rFonts w:ascii="Courier New" w:hAnsi="Courier New" w:cs="Courier New"/>
+          <w:sz w:val="12"/>
+          <w:szCs w:val="12"/>
+        </w:rPr>
+        <w:t xml:space="preserve">, </w:t>
+      </w:r>
+      <w:proofErr w:type="spellStart"/>
+      <w:proofErr w:type="gramStart"/>
+      <w:r>
+        <w:rPr>
+          <w:rFonts w:ascii="Courier New" w:hAnsi="Courier New" w:cs="Courier New"/>
+          <w:sz w:val="12"/>
+          <w:szCs w:val="12"/>
+        </w:rPr>
+        <w:t>t.date</w:t>
+      </w:r>
+      <w:proofErr w:type="spellEnd"/>
+      <w:proofErr w:type="gramEnd"/>
+      <w:r>
+        <w:rPr>
+          <w:rFonts w:ascii="Courier New" w:hAnsi="Courier New" w:cs="Courier New"/>
+          <w:sz w:val="12"/>
+          <w:szCs w:val="12"/>
+        </w:rPr>
+        <w:t>, cc.name, phys.name, n.name from treatments t</w:t>
+      </w:r>
+    </w:p>
+    <w:p>
+      <w:pPr>
+        <w:pStyle w:val="ListParagraph"/>
+        <w:rPr>
+          <w:rFonts w:ascii="Courier New" w:hAnsi="Courier New" w:cs="Courier New"/>
+          <w:sz w:val="12"/>
+          <w:szCs w:val="12"/>
+        </w:rPr>
+      </w:pPr>
+      <w:r>
+        <w:rPr>
+          <w:rFonts w:ascii="Courier New" w:hAnsi="Courier New" w:cs="Courier New"/>
+          <w:sz w:val="12"/>
+          <w:szCs w:val="12"/>
+        </w:rPr>
+        <w:t xml:space="preserve">inner join patients pat on </w:t>
+      </w:r>
+      <w:proofErr w:type="spellStart"/>
+      <w:proofErr w:type="gramStart"/>
+      <w:r>
+        <w:rPr>
+          <w:rFonts w:ascii="Courier New" w:hAnsi="Courier New" w:cs="Courier New"/>
+          <w:sz w:val="12"/>
+          <w:szCs w:val="12"/>
+        </w:rPr>
+        <w:t>t.patient</w:t>
+      </w:r>
+      <w:proofErr w:type="gramEnd"/>
+      <w:r>
+        <w:rPr>
+          <w:rFonts w:ascii="Courier New" w:hAnsi="Courier New" w:cs="Courier New"/>
+          <w:sz w:val="12"/>
+          <w:szCs w:val="12"/>
+        </w:rPr>
+        <w:t>_id</w:t>
+      </w:r>
+      <w:proofErr w:type="spellEnd"/>
+      <w:r>
+        <w:rPr>
+          <w:rFonts w:ascii="Courier New" w:hAnsi="Courier New" w:cs="Courier New"/>
+          <w:sz w:val="12"/>
+          <w:szCs w:val="12"/>
+        </w:rPr>
+        <w:t xml:space="preserve"> = </w:t>
+      </w:r>
+      <w:proofErr w:type="spellStart"/>
+      <w:r>
+        <w:rPr>
+          <w:rFonts w:ascii="Courier New" w:hAnsi="Courier New" w:cs="Courier New"/>
+          <w:sz w:val="12"/>
+          <w:szCs w:val="12"/>
+        </w:rPr>
+        <w:t>pat.pid</w:t>
+      </w:r>
+      <w:proofErr w:type="spellEnd"/>
+    </w:p>
+    <w:p>
+      <w:pPr>
+        <w:pStyle w:val="ListParagraph"/>
+        <w:rPr>
+          <w:rFonts w:ascii="Courier New" w:hAnsi="Courier New" w:cs="Courier New"/>
+          <w:sz w:val="12"/>
+          <w:szCs w:val="12"/>
+        </w:rPr>
+      </w:pPr>
+      <w:r>
+        <w:rPr>
+          <w:rFonts w:ascii="Courier New" w:hAnsi="Courier New" w:cs="Courier New"/>
+          <w:sz w:val="12"/>
+          <w:szCs w:val="12"/>
+        </w:rPr>
+        <w:t xml:space="preserve">inner join physicians </w:t>
+      </w:r>
+      <w:proofErr w:type="spellStart"/>
+      <w:r>
+        <w:rPr>
+          <w:rFonts w:ascii="Courier New" w:hAnsi="Courier New" w:cs="Courier New"/>
+          <w:sz w:val="12"/>
+          <w:szCs w:val="12"/>
+        </w:rPr>
+        <w:t>phys</w:t>
+      </w:r>
+      <w:proofErr w:type="spellEnd"/>
+      <w:r>
+        <w:rPr>
+          <w:rFonts w:ascii="Courier New" w:hAnsi="Courier New" w:cs="Courier New"/>
+          <w:sz w:val="12"/>
+          <w:szCs w:val="12"/>
+        </w:rPr>
+        <w:t xml:space="preserve"> on </w:t>
+      </w:r>
+      <w:proofErr w:type="spellStart"/>
+      <w:proofErr w:type="gramStart"/>
+      <w:r>
+        <w:rPr>
+          <w:rFonts w:ascii="Courier New" w:hAnsi="Courier New" w:cs="Courier New"/>
+          <w:sz w:val="12"/>
+          <w:szCs w:val="12"/>
+        </w:rPr>
+        <w:t>t.physician</w:t>
+      </w:r>
+      <w:proofErr w:type="gramEnd"/>
+      <w:r>
+        <w:rPr>
+          <w:rFonts w:ascii="Courier New" w:hAnsi="Courier New" w:cs="Courier New"/>
+          <w:sz w:val="12"/>
+          <w:szCs w:val="12"/>
+        </w:rPr>
+        <w:t>_id</w:t>
+      </w:r>
+      <w:proofErr w:type="spellEnd"/>
+      <w:r>
+        <w:rPr>
+          <w:rFonts w:ascii="Courier New" w:hAnsi="Courier New" w:cs="Courier New"/>
+          <w:sz w:val="12"/>
+          <w:szCs w:val="12"/>
+        </w:rPr>
+        <w:t xml:space="preserve"> = </w:t>
+      </w:r>
+      <w:proofErr w:type="spellStart"/>
+      <w:proofErr w:type="gramStart"/>
+      <w:r>
+        <w:rPr>
+          <w:rFonts w:ascii="Courier New" w:hAnsi="Courier New" w:cs="Courier New"/>
+          <w:sz w:val="12"/>
+          <w:szCs w:val="12"/>
+        </w:rPr>
+        <w:t>phys.phid</w:t>
+      </w:r>
+      <w:proofErr w:type="spellEnd"/>
+      <w:proofErr w:type="gramEnd"/>
+    </w:p>
+    <w:p>
+      <w:pPr>
+        <w:pStyle w:val="ListParagraph"/>
+        <w:rPr>
+          <w:rFonts w:ascii="Courier New" w:hAnsi="Courier New" w:cs="Courier New"/>
+          <w:sz w:val="12"/>
+          <w:szCs w:val="12"/>
+        </w:rPr>
+      </w:pPr>
+      <w:r>
+        <w:rPr>
+          <w:rFonts w:ascii="Courier New" w:hAnsi="Courier New" w:cs="Courier New"/>
+          <w:sz w:val="12"/>
+          <w:szCs w:val="12"/>
+        </w:rPr>
+        <w:t xml:space="preserve">inner join </w:t>
+      </w:r>
+      <w:proofErr w:type="spellStart"/>
+      <w:r>
+        <w:rPr>
+          <w:rFonts w:ascii="Courier New" w:hAnsi="Courier New" w:cs="Courier New"/>
+          <w:sz w:val="12"/>
+          <w:szCs w:val="12"/>
+        </w:rPr>
+        <w:t>care_centers</w:t>
+      </w:r>
+      <w:proofErr w:type="spellEnd"/>
+      <w:r>
+        <w:rPr>
+          <w:rFonts w:ascii="Courier New" w:hAnsi="Courier New" w:cs="Courier New"/>
+          <w:sz w:val="12"/>
+          <w:szCs w:val="12"/>
+        </w:rPr>
+        <w:t xml:space="preserve"> cc on </w:t>
+      </w:r>
+      <w:proofErr w:type="spellStart"/>
+      <w:proofErr w:type="gramStart"/>
+      <w:r>
+        <w:rPr>
+          <w:rFonts w:ascii="Courier New" w:hAnsi="Courier New" w:cs="Courier New"/>
+          <w:sz w:val="12"/>
+          <w:szCs w:val="12"/>
+        </w:rPr>
+        <w:t>pat.care</w:t>
+      </w:r>
+      <w:proofErr w:type="gramEnd"/>
+      <w:r>
+        <w:rPr>
+          <w:rFonts w:ascii="Courier New" w:hAnsi="Courier New" w:cs="Courier New"/>
+          <w:sz w:val="12"/>
+          <w:szCs w:val="12"/>
+        </w:rPr>
+        <w:t>_center_id</w:t>
+      </w:r>
+      <w:proofErr w:type="spellEnd"/>
+      <w:r>
+        <w:rPr>
+          <w:rFonts w:ascii="Courier New" w:hAnsi="Courier New" w:cs="Courier New"/>
+          <w:sz w:val="12"/>
+          <w:szCs w:val="12"/>
+        </w:rPr>
+        <w:t xml:space="preserve"> = </w:t>
+      </w:r>
+      <w:proofErr w:type="spellStart"/>
+      <w:r>
+        <w:rPr>
+          <w:rFonts w:ascii="Courier New" w:hAnsi="Courier New" w:cs="Courier New"/>
+          <w:sz w:val="12"/>
+          <w:szCs w:val="12"/>
+        </w:rPr>
+        <w:t>cc.cid</w:t>
+      </w:r>
+      <w:proofErr w:type="spellEnd"/>
+    </w:p>
+    <w:p>
+      <w:pPr>
+        <w:pStyle w:val="ListParagraph"/>
+        <w:rPr>
+          <w:rFonts w:ascii="Courier New" w:hAnsi="Courier New" w:cs="Courier New"/>
+          <w:sz w:val="12"/>
+          <w:szCs w:val="12"/>
+        </w:rPr>
+      </w:pPr>
+      <w:r>
+        <w:rPr>
+          <w:rFonts w:ascii="Courier New" w:hAnsi="Courier New" w:cs="Courier New"/>
+          <w:sz w:val="12"/>
+          <w:szCs w:val="12"/>
+        </w:rPr>
+        <w:t xml:space="preserve">inner join nurses n on </w:t>
+      </w:r>
+      <w:proofErr w:type="spellStart"/>
+      <w:proofErr w:type="gramStart"/>
+      <w:r>
+        <w:rPr>
+          <w:rFonts w:ascii="Courier New" w:hAnsi="Courier New" w:cs="Courier New"/>
+          <w:sz w:val="12"/>
+          <w:szCs w:val="12"/>
+        </w:rPr>
+        <w:t>cc.nurse</w:t>
+      </w:r>
+      <w:proofErr w:type="gramEnd"/>
+      <w:r>
+        <w:rPr>
+          <w:rFonts w:ascii="Courier New" w:hAnsi="Courier New" w:cs="Courier New"/>
+          <w:sz w:val="12"/>
+          <w:szCs w:val="12"/>
+        </w:rPr>
+        <w:t>_charge_id</w:t>
+      </w:r>
+      <w:proofErr w:type="spellEnd"/>
+      <w:r>
+        <w:rPr>
+          <w:rFonts w:ascii="Courier New" w:hAnsi="Courier New" w:cs="Courier New"/>
+          <w:sz w:val="12"/>
+          <w:szCs w:val="12"/>
+        </w:rPr>
+        <w:t xml:space="preserve"> = </w:t>
+      </w:r>
+      <w:proofErr w:type="spellStart"/>
+      <w:r>
+        <w:rPr>
+          <w:rFonts w:ascii="Courier New" w:hAnsi="Courier New" w:cs="Courier New"/>
+          <w:sz w:val="12"/>
+          <w:szCs w:val="12"/>
+        </w:rPr>
+        <w:t>n.nid</w:t>
+      </w:r>
+      <w:proofErr w:type="spellEnd"/>
+    </w:p>
+    <w:p>
+      <w:pPr>
+        <w:pStyle w:val="ListParagraph"/>
+        <w:rPr>
+          <w:rFonts w:ascii="Courier New" w:hAnsi="Courier New" w:cs="Courier New"/>
+          <w:sz w:val="12"/>
+          <w:szCs w:val="12"/>
+        </w:rPr>
+      </w:pPr>
+      <w:r>
+        <w:rPr>
+          <w:rFonts w:ascii="Courier New" w:hAnsi="Courier New" w:cs="Courier New"/>
+          <w:sz w:val="12"/>
+          <w:szCs w:val="12"/>
+        </w:rPr>
+        <w:t xml:space="preserve">where </w:t>
+      </w:r>
+      <w:proofErr w:type="spellStart"/>
+      <w:proofErr w:type="gramStart"/>
+      <w:r>
+        <w:rPr>
+          <w:rFonts w:ascii="Courier New" w:hAnsi="Courier New" w:cs="Courier New"/>
+          <w:sz w:val="12"/>
+          <w:szCs w:val="12"/>
+        </w:rPr>
+        <w:t>t.date</w:t>
+      </w:r>
+      <w:proofErr w:type="spellEnd"/>
+      <w:proofErr w:type="gramEnd"/>
+      <w:r>
+        <w:rPr>
+          <w:rFonts w:ascii="Courier New" w:hAnsi="Courier New" w:cs="Courier New"/>
+          <w:sz w:val="12"/>
+          <w:szCs w:val="12"/>
+        </w:rPr>
+        <w:t xml:space="preserve"> &gt; </w:t>
+      </w:r>
+      <w:proofErr w:type="spellStart"/>
+      <w:r>
+        <w:rPr>
+          <w:rFonts w:ascii="Courier New" w:hAnsi="Courier New" w:cs="Courier New"/>
+          <w:sz w:val="12"/>
+          <w:szCs w:val="12"/>
+        </w:rPr>
+        <w:t>sysdate</w:t>
+      </w:r>
+      <w:proofErr w:type="spellEnd"/>
+      <w:r>
+        <w:rPr>
+          <w:rFonts w:ascii="Courier New" w:hAnsi="Courier New" w:cs="Courier New"/>
+          <w:sz w:val="12"/>
+          <w:szCs w:val="12"/>
+        </w:rPr>
+        <w:t xml:space="preserve"> - 365</w:t>
+      </w:r>
+    </w:p>
+    <w:p>
+      <w:pPr>
         <w:pStyle w:val="Heading3"/>
       </w:pPr>
       <w:r>
-        <w:t xml:space="preserve">3. Populate these tables with some sample data and write SQL queries that show the content of each table after entering the data. (6 marks) t </w:t>
+        <w:t xml:space="preserve">4. For some strategic decisions, the president of the hospital needs summary data about the care centres. For each care centre, the president needs to know the number of nurses holding an RN certificate as well as their total and average salaries. Does the following view answer the president’s request? If not, write the correct view that will satisfy the president’s request. (7 marks) </w:t>
+      </w:r>
+    </w:p>
+    <w:p>
+      <w:r>
+        <w:t xml:space="preserve">CREATE VIEW NURSE_SUMMARY (D, C, TOTAL_S, AVERAGE_S) AS SELECT </w:t>
+      </w:r>
+      <w:proofErr w:type="spellStart"/>
+      <w:r>
+        <w:t>cid</w:t>
+      </w:r>
+      <w:proofErr w:type="spellEnd"/>
+      <w:r>
+        <w:t xml:space="preserve">, COUNT (*), SUM (salary), AVG (salary) FROM </w:t>
+      </w:r>
+      <w:proofErr w:type="spellStart"/>
+      <w:r>
+        <w:t>Care_centres</w:t>
+      </w:r>
+      <w:proofErr w:type="spellEnd"/>
+      <w:r>
+        <w:t xml:space="preserve">, Nurses WHERE </w:t>
+      </w:r>
+      <w:proofErr w:type="spellStart"/>
+      <w:r>
+        <w:t>nurse_charge_id</w:t>
+      </w:r>
+      <w:proofErr w:type="spellEnd"/>
+      <w:r>
+        <w:t xml:space="preserve"> = </w:t>
+      </w:r>
+      <w:proofErr w:type="spellStart"/>
+      <w:r>
+        <w:t>nid</w:t>
+      </w:r>
+      <w:proofErr w:type="spellEnd"/>
+      <w:r>
+        <w:t xml:space="preserve"> and </w:t>
+      </w:r>
+      <w:proofErr w:type="spellStart"/>
+      <w:r>
+        <w:t>certificate_type</w:t>
+      </w:r>
+      <w:proofErr w:type="spellEnd"/>
+      <w:r>
+        <w:t xml:space="preserve"> like ‘RN’ GROUP BY </w:t>
+      </w:r>
+      <w:proofErr w:type="spellStart"/>
+      <w:r>
+        <w:t>cid</w:t>
+      </w:r>
+      <w:proofErr w:type="spellEnd"/>
+      <w:r>
+        <w:t xml:space="preserve">; </w:t>
       </w:r>
     </w:p>
     <w:p>
@@ -2890,67 +5924,6 @@
         <w:pStyle w:val="Heading3"/>
       </w:pPr>
       <w:r>
-        <w:t xml:space="preserve">4. For some strategic decisions, the president of the hospital needs summary data about the care centres. For each care centre, the president needs to know the number of nurses holding an RN certificate as well as their total and average salaries. Does the following view answer the president’s request? If not, write the correct view that will satisfy the president’s request. (7 marks) </w:t>
-      </w:r>
-    </w:p>
-    <w:p>
-      <w:r>
-        <w:t xml:space="preserve">CREATE VIEW NURSE_SUMMARY (D, C, TOTAL_S, AVERAGE_S) AS SELECT </w:t>
-      </w:r>
-      <w:proofErr w:type="spellStart"/>
-      <w:r>
-        <w:t>cid</w:t>
-      </w:r>
-      <w:proofErr w:type="spellEnd"/>
-      <w:r>
-        <w:t xml:space="preserve">, COUNT (*), SUM (salary), AVG (salary) FROM </w:t>
-      </w:r>
-      <w:proofErr w:type="spellStart"/>
-      <w:r>
-        <w:t>Care_centres</w:t>
-      </w:r>
-      <w:proofErr w:type="spellEnd"/>
-      <w:r>
-        <w:t xml:space="preserve">, Nurses WHERE </w:t>
-      </w:r>
-      <w:proofErr w:type="spellStart"/>
-      <w:r>
-        <w:t>nurse_charge_id</w:t>
-      </w:r>
-      <w:proofErr w:type="spellEnd"/>
-      <w:r>
-        <w:t xml:space="preserve"> = </w:t>
-      </w:r>
-      <w:proofErr w:type="spellStart"/>
-      <w:r>
-        <w:t>nid</w:t>
-      </w:r>
-      <w:proofErr w:type="spellEnd"/>
-      <w:r>
-        <w:t xml:space="preserve"> and </w:t>
-      </w:r>
-      <w:proofErr w:type="spellStart"/>
-      <w:r>
-        <w:t>certificate_type</w:t>
-      </w:r>
-      <w:proofErr w:type="spellEnd"/>
-      <w:r>
-        <w:t xml:space="preserve"> like ‘RN’ GROUP BY </w:t>
-      </w:r>
-      <w:proofErr w:type="spellStart"/>
-      <w:r>
-        <w:t>cid</w:t>
-      </w:r>
-      <w:proofErr w:type="spellEnd"/>
-      <w:r>
-        <w:t xml:space="preserve">; </w:t>
-      </w:r>
-    </w:p>
-    <w:p>
-      <w:pPr>
-        <w:pStyle w:val="Heading3"/>
-      </w:pPr>
-      <w:r>
         <w:t>5. State which of the following queries and updates would be allowed in this view. If a particular query or update would be allowed, show what the corresponding query or update on the base relations would look like and give its result when applied to the database.</w:t>
       </w:r>
       <w:r>
@@ -2981,6 +5954,7 @@
         <w:ind w:left="720"/>
       </w:pPr>
       <w:r>
+        <w:lastRenderedPageBreak/>
         <w:t xml:space="preserve">Q3. SELECT D, AVERAGE_S FROM NURSE_SUMMARY WHERE C &gt; (SELECT C FROM NURSE_SUMMARY WHERE D=4); </w:t>
       </w:r>
     </w:p>
@@ -3041,7 +6015,6 @@
         </w:numPr>
       </w:pPr>
       <w:r>
-        <w:lastRenderedPageBreak/>
         <w:t xml:space="preserve">Care Centre Name </w:t>
       </w:r>
     </w:p>
@@ -4607,7 +7580,6 @@
   <w:style w:type="character" w:default="1" w:styleId="DefaultParagraphFont">
     <w:name w:val="Default Paragraph Font"/>
     <w:uiPriority w:val="1"/>
-    <w:semiHidden/>
     <w:unhideWhenUsed/>
   </w:style>
   <w:style w:type="table" w:default="1" w:styleId="TableNormal">

</xml_diff>